<commit_message>
v1.3.0: build EXE and UX fixes; docs updated (Add Target/Update u,v notes, beta)
</commit_message>
<xml_diff>
--- a/documentation/softwarex-osp-kon.docx
+++ b/documentation/softwarex-osp-kon.docx
@@ -15,6 +15,7 @@
           <w:lang w:eastAsia="ja-JP"/>
         </w:rPr>
       </w:pPr>
+      <w:proofErr w:type="spellStart"/>
       <w:r>
         <w:rPr>
           <w:rFonts w:ascii="Arial" w:eastAsia="Calibri" w:hAnsi="Arial" w:cs="Arial"/>
@@ -23,7 +24,18 @@
           <w:iCs/>
           <w:szCs w:val="22"/>
         </w:rPr>
-        <w:t>PiXY: Pixel to stage-XY Coordinate Convert</w:t>
+        <w:t>PiXY</w:t>
+      </w:r>
+      <w:proofErr w:type="spellEnd"/>
+      <w:r>
+        <w:rPr>
+          <w:rFonts w:ascii="Arial" w:eastAsia="Calibri" w:hAnsi="Arial" w:cs="Arial"/>
+          <w:b/>
+          <w:i/>
+          <w:iCs/>
+          <w:szCs w:val="22"/>
+        </w:rPr>
+        <w:t>: Pixel to stage-XY Coordinate Convert</w:t>
       </w:r>
       <w:r>
         <w:rPr>
@@ -187,13 +199,23 @@
           <w:lang w:eastAsia="ja-JP"/>
         </w:rPr>
       </w:pPr>
-      <w:r>
-        <w:rPr>
-          <w:rFonts w:ascii="Arial" w:hAnsi="Arial" w:cs="Arial"/>
-          <w:szCs w:val="22"/>
-          <w:lang w:eastAsia="ja-JP"/>
-        </w:rPr>
-        <w:t>PiXY is open</w:t>
+      <w:proofErr w:type="spellStart"/>
+      <w:r>
+        <w:rPr>
+          <w:rFonts w:ascii="Arial" w:hAnsi="Arial" w:cs="Arial"/>
+          <w:szCs w:val="22"/>
+          <w:lang w:eastAsia="ja-JP"/>
+        </w:rPr>
+        <w:t>PiXY</w:t>
+      </w:r>
+      <w:proofErr w:type="spellEnd"/>
+      <w:r>
+        <w:rPr>
+          <w:rFonts w:ascii="Arial" w:hAnsi="Arial" w:cs="Arial"/>
+          <w:szCs w:val="22"/>
+          <w:lang w:eastAsia="ja-JP"/>
+        </w:rPr>
+        <w:t xml:space="preserve"> is open</w:t>
       </w:r>
       <w:r>
         <w:rPr>
@@ -225,7 +247,79 @@
           <w:szCs w:val="22"/>
           <w:lang w:eastAsia="ja-JP"/>
         </w:rPr>
-        <w:t>instrument stages in microanalysis workflows for geoscience and materials science, thereby reducing manual time and human error. PiXY automatically extracts particle centroids (u,v)(u,v)(u,v) by combining K</w:t>
+        <w:t xml:space="preserve">instrument stages in microanalysis workflows for geoscience and materials science, thereby reducing manual time and human error. </w:t>
+      </w:r>
+      <w:proofErr w:type="spellStart"/>
+      <w:r>
+        <w:rPr>
+          <w:rFonts w:ascii="Arial" w:hAnsi="Arial" w:cs="Arial"/>
+          <w:szCs w:val="22"/>
+          <w:lang w:eastAsia="ja-JP"/>
+        </w:rPr>
+        <w:t>PiXY</w:t>
+      </w:r>
+      <w:proofErr w:type="spellEnd"/>
+      <w:r>
+        <w:rPr>
+          <w:rFonts w:ascii="Arial" w:hAnsi="Arial" w:cs="Arial"/>
+          <w:szCs w:val="22"/>
+          <w:lang w:eastAsia="ja-JP"/>
+        </w:rPr>
+        <w:t xml:space="preserve"> automatically extracts particle centroids (</w:t>
+      </w:r>
+      <w:proofErr w:type="spellStart"/>
+      <w:r>
+        <w:rPr>
+          <w:rFonts w:ascii="Arial" w:hAnsi="Arial" w:cs="Arial"/>
+          <w:szCs w:val="22"/>
+          <w:lang w:eastAsia="ja-JP"/>
+        </w:rPr>
+        <w:t>u,v</w:t>
+      </w:r>
+      <w:proofErr w:type="spellEnd"/>
+      <w:r>
+        <w:rPr>
+          <w:rFonts w:ascii="Arial" w:hAnsi="Arial" w:cs="Arial"/>
+          <w:szCs w:val="22"/>
+          <w:lang w:eastAsia="ja-JP"/>
+        </w:rPr>
+        <w:t>)(</w:t>
+      </w:r>
+      <w:proofErr w:type="spellStart"/>
+      <w:r>
+        <w:rPr>
+          <w:rFonts w:ascii="Arial" w:hAnsi="Arial" w:cs="Arial"/>
+          <w:szCs w:val="22"/>
+          <w:lang w:eastAsia="ja-JP"/>
+        </w:rPr>
+        <w:t>u,v</w:t>
+      </w:r>
+      <w:proofErr w:type="spellEnd"/>
+      <w:r>
+        <w:rPr>
+          <w:rFonts w:ascii="Arial" w:hAnsi="Arial" w:cs="Arial"/>
+          <w:szCs w:val="22"/>
+          <w:lang w:eastAsia="ja-JP"/>
+        </w:rPr>
+        <w:t>)(</w:t>
+      </w:r>
+      <w:proofErr w:type="spellStart"/>
+      <w:r>
+        <w:rPr>
+          <w:rFonts w:ascii="Arial" w:hAnsi="Arial" w:cs="Arial"/>
+          <w:szCs w:val="22"/>
+          <w:lang w:eastAsia="ja-JP"/>
+        </w:rPr>
+        <w:t>u,v</w:t>
+      </w:r>
+      <w:proofErr w:type="spellEnd"/>
+      <w:r>
+        <w:rPr>
+          <w:rFonts w:ascii="Arial" w:hAnsi="Arial" w:cs="Arial"/>
+          <w:szCs w:val="22"/>
+          <w:lang w:eastAsia="ja-JP"/>
+        </w:rPr>
+        <w:t>) by combining K</w:t>
       </w:r>
       <w:r>
         <w:rPr>
@@ -241,7 +335,25 @@
           <w:szCs w:val="22"/>
           <w:lang w:eastAsia="ja-JP"/>
         </w:rPr>
-        <w:t>means color segmentation with connected</w:t>
+        <w:t xml:space="preserve">means </w:t>
+      </w:r>
+      <w:proofErr w:type="spellStart"/>
+      <w:r>
+        <w:rPr>
+          <w:rFonts w:ascii="Arial" w:hAnsi="Arial" w:cs="Arial"/>
+          <w:szCs w:val="22"/>
+          <w:lang w:eastAsia="ja-JP"/>
+        </w:rPr>
+        <w:t>color</w:t>
+      </w:r>
+      <w:proofErr w:type="spellEnd"/>
+      <w:r>
+        <w:rPr>
+          <w:rFonts w:ascii="Arial" w:hAnsi="Arial" w:cs="Arial"/>
+          <w:szCs w:val="22"/>
+          <w:lang w:eastAsia="ja-JP"/>
+        </w:rPr>
+        <w:t xml:space="preserve"> segmentation with connected</w:t>
       </w:r>
       <w:r>
         <w:rPr>
@@ -311,13 +423,23 @@
           <w:lang w:eastAsia="ja-JP"/>
         </w:rPr>
       </w:pPr>
-      <w:r>
-        <w:rPr>
-          <w:rFonts w:ascii="Arial" w:hAnsi="Arial" w:cs="Arial"/>
-          <w:szCs w:val="22"/>
-          <w:lang w:eastAsia="ja-JP"/>
-        </w:rPr>
-        <w:t>PiXY supports offline targeting, enabling users to select targets on pre</w:t>
+      <w:proofErr w:type="spellStart"/>
+      <w:r>
+        <w:rPr>
+          <w:rFonts w:ascii="Arial" w:hAnsi="Arial" w:cs="Arial"/>
+          <w:szCs w:val="22"/>
+          <w:lang w:eastAsia="ja-JP"/>
+        </w:rPr>
+        <w:t>PiXY</w:t>
+      </w:r>
+      <w:proofErr w:type="spellEnd"/>
+      <w:r>
+        <w:rPr>
+          <w:rFonts w:ascii="Arial" w:hAnsi="Arial" w:cs="Arial"/>
+          <w:szCs w:val="22"/>
+          <w:lang w:eastAsia="ja-JP"/>
+        </w:rPr>
+        <w:t xml:space="preserve"> supports offline targeting, enabling users to select targets on pre</w:t>
       </w:r>
       <w:r>
         <w:rPr>
@@ -409,7 +531,115 @@
           <w:szCs w:val="22"/>
           <w:lang w:eastAsia="ja-JP"/>
         </w:rPr>
-        <w:t>instrument reaching error (residual) for positions specified on images. Fifty percent of residuals were within 3 μm (X), 3 μm (Y), and 4 μm (Z), and 90% were within 10 μm (X), 16 μm (Y), and 21 μm (Z), demonstrating accuracy sufficient for practical operation.</w:t>
+        <w:t>instrument reaching error (residual) for positions specified on images. Fifty percent of residuals were within 3 </w:t>
+      </w:r>
+      <w:proofErr w:type="spellStart"/>
+      <w:r>
+        <w:rPr>
+          <w:rFonts w:ascii="Arial" w:hAnsi="Arial" w:cs="Arial"/>
+          <w:szCs w:val="22"/>
+          <w:lang w:eastAsia="ja-JP"/>
+        </w:rPr>
+        <w:t>μm</w:t>
+      </w:r>
+      <w:proofErr w:type="spellEnd"/>
+      <w:r>
+        <w:rPr>
+          <w:rFonts w:ascii="Arial" w:hAnsi="Arial" w:cs="Arial"/>
+          <w:szCs w:val="22"/>
+          <w:lang w:eastAsia="ja-JP"/>
+        </w:rPr>
+        <w:t xml:space="preserve"> (X), 3 </w:t>
+      </w:r>
+      <w:proofErr w:type="spellStart"/>
+      <w:r>
+        <w:rPr>
+          <w:rFonts w:ascii="Arial" w:hAnsi="Arial" w:cs="Arial"/>
+          <w:szCs w:val="22"/>
+          <w:lang w:eastAsia="ja-JP"/>
+        </w:rPr>
+        <w:t>μm</w:t>
+      </w:r>
+      <w:proofErr w:type="spellEnd"/>
+      <w:r>
+        <w:rPr>
+          <w:rFonts w:ascii="Arial" w:hAnsi="Arial" w:cs="Arial"/>
+          <w:szCs w:val="22"/>
+          <w:lang w:eastAsia="ja-JP"/>
+        </w:rPr>
+        <w:t xml:space="preserve"> (Y), and 4 </w:t>
+      </w:r>
+      <w:proofErr w:type="spellStart"/>
+      <w:r>
+        <w:rPr>
+          <w:rFonts w:ascii="Arial" w:hAnsi="Arial" w:cs="Arial"/>
+          <w:szCs w:val="22"/>
+          <w:lang w:eastAsia="ja-JP"/>
+        </w:rPr>
+        <w:t>μm</w:t>
+      </w:r>
+      <w:proofErr w:type="spellEnd"/>
+      <w:r>
+        <w:rPr>
+          <w:rFonts w:ascii="Arial" w:hAnsi="Arial" w:cs="Arial"/>
+          <w:szCs w:val="22"/>
+          <w:lang w:eastAsia="ja-JP"/>
+        </w:rPr>
+        <w:t xml:space="preserve"> (Z), and 90% were within 10 </w:t>
+      </w:r>
+      <w:proofErr w:type="spellStart"/>
+      <w:r>
+        <w:rPr>
+          <w:rFonts w:ascii="Arial" w:hAnsi="Arial" w:cs="Arial"/>
+          <w:szCs w:val="22"/>
+          <w:lang w:eastAsia="ja-JP"/>
+        </w:rPr>
+        <w:t>μm</w:t>
+      </w:r>
+      <w:proofErr w:type="spellEnd"/>
+      <w:r>
+        <w:rPr>
+          <w:rFonts w:ascii="Arial" w:hAnsi="Arial" w:cs="Arial"/>
+          <w:szCs w:val="22"/>
+          <w:lang w:eastAsia="ja-JP"/>
+        </w:rPr>
+        <w:t xml:space="preserve"> (X), 16 </w:t>
+      </w:r>
+      <w:proofErr w:type="spellStart"/>
+      <w:r>
+        <w:rPr>
+          <w:rFonts w:ascii="Arial" w:hAnsi="Arial" w:cs="Arial"/>
+          <w:szCs w:val="22"/>
+          <w:lang w:eastAsia="ja-JP"/>
+        </w:rPr>
+        <w:t>μm</w:t>
+      </w:r>
+      <w:proofErr w:type="spellEnd"/>
+      <w:r>
+        <w:rPr>
+          <w:rFonts w:ascii="Arial" w:hAnsi="Arial" w:cs="Arial"/>
+          <w:szCs w:val="22"/>
+          <w:lang w:eastAsia="ja-JP"/>
+        </w:rPr>
+        <w:t xml:space="preserve"> (Y), and 21 </w:t>
+      </w:r>
+      <w:proofErr w:type="spellStart"/>
+      <w:r>
+        <w:rPr>
+          <w:rFonts w:ascii="Arial" w:hAnsi="Arial" w:cs="Arial"/>
+          <w:szCs w:val="22"/>
+          <w:lang w:eastAsia="ja-JP"/>
+        </w:rPr>
+        <w:t>μm</w:t>
+      </w:r>
+      <w:proofErr w:type="spellEnd"/>
+      <w:r>
+        <w:rPr>
+          <w:rFonts w:ascii="Arial" w:hAnsi="Arial" w:cs="Arial"/>
+          <w:szCs w:val="22"/>
+          <w:lang w:eastAsia="ja-JP"/>
+        </w:rPr>
+        <w:t xml:space="preserve"> (Z), demonstrating accuracy sufficient for practical operation.</w:t>
       </w:r>
     </w:p>
     <w:p>
@@ -1271,7 +1501,24 @@
                 <w:i/>
                 <w:szCs w:val="22"/>
               </w:rPr>
-              <w:t>https://github.com/YoshiakiKON/PiXY/tree/main/documentation/Manual_EN.md</w:t>
+              <w:t>https://github.com/YoshiakiKON/PiXY/tree/main/documentation/</w:t>
+            </w:r>
+            <w:r>
+              <w:rPr>
+                <w:rFonts w:ascii="Arial" w:hAnsi="Arial" w:cs="Arial" w:hint="eastAsia"/>
+                <w:i/>
+                <w:szCs w:val="22"/>
+                <w:lang w:eastAsia="ja-JP"/>
+              </w:rPr>
+              <w:t>InstructionM</w:t>
+            </w:r>
+            <w:r>
+              <w:rPr>
+                <w:rFonts w:ascii="Arial" w:hAnsi="Arial" w:cs="Arial"/>
+                <w:i/>
+                <w:szCs w:val="22"/>
+              </w:rPr>
+              <w:t>anual_EN.md</w:t>
             </w:r>
           </w:p>
         </w:tc>
@@ -1482,8 +1729,18 @@
           <w:i/>
           <w:szCs w:val="22"/>
         </w:rPr>
-        <w:t>EDS require micrometer</w:t>
-      </w:r>
+        <w:t xml:space="preserve">EDS require </w:t>
+      </w:r>
+      <w:proofErr w:type="spellStart"/>
+      <w:r>
+        <w:rPr>
+          <w:rFonts w:ascii="Arial" w:eastAsia="Calibri" w:hAnsi="Arial" w:cs="Arial"/>
+          <w:i/>
+          <w:szCs w:val="22"/>
+        </w:rPr>
+        <w:t>micrometer</w:t>
+      </w:r>
+      <w:proofErr w:type="spellEnd"/>
       <w:r>
         <w:rPr>
           <w:rFonts w:ascii="Cambria Math" w:eastAsia="Calibri" w:hAnsi="Cambria Math" w:cs="Cambria Math"/>
@@ -1672,7 +1929,25 @@
           <w:i/>
           <w:szCs w:val="22"/>
         </w:rPr>
-        <w:t>ready coordinate list. PiXY integrates this sequence in a single application, enabling trial</w:t>
+        <w:t xml:space="preserve">ready coordinate list. </w:t>
+      </w:r>
+      <w:proofErr w:type="spellStart"/>
+      <w:r>
+        <w:rPr>
+          <w:rFonts w:ascii="Arial" w:eastAsia="Calibri" w:hAnsi="Arial" w:cs="Arial"/>
+          <w:i/>
+          <w:szCs w:val="22"/>
+        </w:rPr>
+        <w:t>PiXY</w:t>
+      </w:r>
+      <w:proofErr w:type="spellEnd"/>
+      <w:r>
+        <w:rPr>
+          <w:rFonts w:ascii="Arial" w:eastAsia="Calibri" w:hAnsi="Arial" w:cs="Arial"/>
+          <w:i/>
+          <w:szCs w:val="22"/>
+        </w:rPr>
+        <w:t xml:space="preserve"> integrates this sequence in a single application, enabling trial</w:t>
       </w:r>
       <w:r>
         <w:rPr>
@@ -1734,7 +2009,25 @@
           <w:i/>
           <w:szCs w:val="22"/>
         </w:rPr>
-        <w:t>In this work, we present PiXY and provide an open</w:t>
+        <w:t xml:space="preserve">In this work, we present </w:t>
+      </w:r>
+      <w:proofErr w:type="spellStart"/>
+      <w:r>
+        <w:rPr>
+          <w:rFonts w:ascii="Arial" w:eastAsia="Calibri" w:hAnsi="Arial" w:cs="Arial"/>
+          <w:i/>
+          <w:szCs w:val="22"/>
+        </w:rPr>
+        <w:t>PiXY</w:t>
+      </w:r>
+      <w:proofErr w:type="spellEnd"/>
+      <w:r>
+        <w:rPr>
+          <w:rFonts w:ascii="Arial" w:eastAsia="Calibri" w:hAnsi="Arial" w:cs="Arial"/>
+          <w:i/>
+          <w:szCs w:val="22"/>
+        </w:rPr>
+        <w:t xml:space="preserve"> and provide an open</w:t>
       </w:r>
       <w:r>
         <w:rPr>
@@ -1750,7 +2043,25 @@
           <w:i/>
           <w:szCs w:val="22"/>
         </w:rPr>
-        <w:t>source GUI workflow from particle detection (centroid extraction) through coordinate transformation and batch export of target coordinates. With PiXY, part of the targeting workload on the analytical instrument can be shifted to offline targeting (selecting targets and preparing coordinates before instrument time), thereby shortening non</w:t>
+        <w:t xml:space="preserve">source GUI workflow from particle detection (centroid extraction) through coordinate transformation and batch export of target coordinates. With </w:t>
+      </w:r>
+      <w:proofErr w:type="spellStart"/>
+      <w:r>
+        <w:rPr>
+          <w:rFonts w:ascii="Arial" w:eastAsia="Calibri" w:hAnsi="Arial" w:cs="Arial"/>
+          <w:i/>
+          <w:szCs w:val="22"/>
+        </w:rPr>
+        <w:t>PiXY</w:t>
+      </w:r>
+      <w:proofErr w:type="spellEnd"/>
+      <w:r>
+        <w:rPr>
+          <w:rFonts w:ascii="Arial" w:eastAsia="Calibri" w:hAnsi="Arial" w:cs="Arial"/>
+          <w:i/>
+          <w:szCs w:val="22"/>
+        </w:rPr>
+        <w:t>, part of the targeting workload on the analytical instrument can be shifted to offline targeting (selecting targets and preparing coordinates before instrument time), thereby shortening non</w:t>
       </w:r>
       <w:r>
         <w:rPr>
@@ -1900,13 +2211,23 @@
           <w:lang w:eastAsia="ja-JP"/>
         </w:rPr>
       </w:pPr>
-      <w:r>
-        <w:rPr>
-          <w:rFonts w:ascii="Arial" w:eastAsia="Calibri" w:hAnsi="Arial" w:cs="Arial"/>
-          <w:i/>
-          <w:szCs w:val="22"/>
-        </w:rPr>
-        <w:t>PiXY is a desktop GUI application that unifies, in a single workflow, (1) generating candidates (particle regions and centroids) from pre</w:t>
+      <w:proofErr w:type="spellStart"/>
+      <w:r>
+        <w:rPr>
+          <w:rFonts w:ascii="Arial" w:eastAsia="Calibri" w:hAnsi="Arial" w:cs="Arial"/>
+          <w:i/>
+          <w:szCs w:val="22"/>
+        </w:rPr>
+        <w:t>PiXY</w:t>
+      </w:r>
+      <w:proofErr w:type="spellEnd"/>
+      <w:r>
+        <w:rPr>
+          <w:rFonts w:ascii="Arial" w:eastAsia="Calibri" w:hAnsi="Arial" w:cs="Arial"/>
+          <w:i/>
+          <w:szCs w:val="22"/>
+        </w:rPr>
+        <w:t xml:space="preserve"> is a desktop GUI application that unifies, in a single workflow, (1) generating candidates (particle regions and centroids) from pre</w:t>
       </w:r>
       <w:r>
         <w:rPr>
@@ -1954,7 +2275,25 @@
           <w:i/>
           <w:szCs w:val="22"/>
         </w:rPr>
-        <w:t>ready coordinate tables (Figure 1). Internally, PiXY comprises GUI components (image display and overlay rendering; table editing for candidates and fiducials), image processing (K</w:t>
+        <w:t xml:space="preserve">ready coordinate tables (Figure 1). Internally, </w:t>
+      </w:r>
+      <w:proofErr w:type="spellStart"/>
+      <w:r>
+        <w:rPr>
+          <w:rFonts w:ascii="Arial" w:eastAsia="Calibri" w:hAnsi="Arial" w:cs="Arial"/>
+          <w:i/>
+          <w:szCs w:val="22"/>
+        </w:rPr>
+        <w:t>PiXY</w:t>
+      </w:r>
+      <w:proofErr w:type="spellEnd"/>
+      <w:r>
+        <w:rPr>
+          <w:rFonts w:ascii="Arial" w:eastAsia="Calibri" w:hAnsi="Arial" w:cs="Arial"/>
+          <w:i/>
+          <w:szCs w:val="22"/>
+        </w:rPr>
+        <w:t xml:space="preserve"> comprises GUI components (image display and overlay rendering; table editing for candidates and fiducials), image processing (K</w:t>
       </w:r>
       <w:r>
         <w:rPr>
@@ -1970,7 +2309,25 @@
           <w:i/>
           <w:szCs w:val="22"/>
         </w:rPr>
-        <w:t>means–based color segmentation [2], connected</w:t>
+        <w:t xml:space="preserve">means–based </w:t>
+      </w:r>
+      <w:proofErr w:type="spellStart"/>
+      <w:r>
+        <w:rPr>
+          <w:rFonts w:ascii="Arial" w:eastAsia="Calibri" w:hAnsi="Arial" w:cs="Arial"/>
+          <w:i/>
+          <w:szCs w:val="22"/>
+        </w:rPr>
+        <w:t>color</w:t>
+      </w:r>
+      <w:proofErr w:type="spellEnd"/>
+      <w:r>
+        <w:rPr>
+          <w:rFonts w:ascii="Arial" w:eastAsia="Calibri" w:hAnsi="Arial" w:cs="Arial"/>
+          <w:i/>
+          <w:szCs w:val="22"/>
+        </w:rPr>
+        <w:t xml:space="preserve"> segmentation [2], connected</w:t>
       </w:r>
       <w:r>
         <w:rPr>
@@ -2041,13 +2398,23 @@
           <w:lang w:eastAsia="ja-JP"/>
         </w:rPr>
       </w:pPr>
-      <w:r>
-        <w:rPr>
-          <w:rFonts w:ascii="Arial" w:eastAsia="Calibri" w:hAnsi="Arial" w:cs="Arial"/>
-          <w:i/>
-          <w:szCs w:val="22"/>
-        </w:rPr>
-        <w:t>PiXY is implemented in Python 3.8+. The GUI uses PySide6 (Qt for Python) [3], and image processing relies on OpenCV [4] and NumPy [5].</w:t>
+      <w:proofErr w:type="spellStart"/>
+      <w:r>
+        <w:rPr>
+          <w:rFonts w:ascii="Arial" w:eastAsia="Calibri" w:hAnsi="Arial" w:cs="Arial"/>
+          <w:i/>
+          <w:szCs w:val="22"/>
+        </w:rPr>
+        <w:t>PiXY</w:t>
+      </w:r>
+      <w:proofErr w:type="spellEnd"/>
+      <w:r>
+        <w:rPr>
+          <w:rFonts w:ascii="Arial" w:eastAsia="Calibri" w:hAnsi="Arial" w:cs="Arial"/>
+          <w:i/>
+          <w:szCs w:val="22"/>
+        </w:rPr>
+        <w:t xml:space="preserve"> is implemented in Python 3.8+. The GUI uses PySide6 (Qt for Python) [3], and image processing relies on OpenCV [4] and NumPy [5].</w:t>
       </w:r>
     </w:p>
     <w:p>
@@ -2139,7 +2506,43 @@
           <w:i/>
           <w:szCs w:val="22"/>
         </w:rPr>
-        <w:t>Figure 1: Example of the PiXY GUI showing (i) particle recognition and centroid overlays, (ii) particle-recognition and centroid-extraction parameters, (iii) fiducial points and residuals, and (iv) exportable coordinate tables.</w:t>
+        <w:t xml:space="preserve">Figure 1: Example of the </w:t>
+      </w:r>
+      <w:proofErr w:type="spellStart"/>
+      <w:r>
+        <w:rPr>
+          <w:rFonts w:ascii="Arial" w:eastAsia="Calibri" w:hAnsi="Arial" w:cs="Arial"/>
+          <w:i/>
+          <w:szCs w:val="22"/>
+        </w:rPr>
+        <w:t>PiXY</w:t>
+      </w:r>
+      <w:proofErr w:type="spellEnd"/>
+      <w:r>
+        <w:rPr>
+          <w:rFonts w:ascii="Arial" w:eastAsia="Calibri" w:hAnsi="Arial" w:cs="Arial"/>
+          <w:i/>
+          <w:szCs w:val="22"/>
+        </w:rPr>
+        <w:t xml:space="preserve"> GUI showing (</w:t>
+      </w:r>
+      <w:proofErr w:type="spellStart"/>
+      <w:r>
+        <w:rPr>
+          <w:rFonts w:ascii="Arial" w:eastAsia="Calibri" w:hAnsi="Arial" w:cs="Arial"/>
+          <w:i/>
+          <w:szCs w:val="22"/>
+        </w:rPr>
+        <w:t>i</w:t>
+      </w:r>
+      <w:proofErr w:type="spellEnd"/>
+      <w:r>
+        <w:rPr>
+          <w:rFonts w:ascii="Arial" w:eastAsia="Calibri" w:hAnsi="Arial" w:cs="Arial"/>
+          <w:i/>
+          <w:szCs w:val="22"/>
+        </w:rPr>
+        <w:t>) particle recognition and centroid overlays, (ii) particle-recognition and centroid-extraction parameters, (iii) fiducial points and residuals, and (iv) exportable coordinate tables.</w:t>
       </w:r>
       <w:r>
         <w:rPr>
@@ -2224,13 +2627,23 @@
           <w:lang w:eastAsia="ja-JP"/>
         </w:rPr>
       </w:pPr>
-      <w:r>
-        <w:rPr>
-          <w:rFonts w:ascii="Arial" w:eastAsia="Calibri" w:hAnsi="Arial" w:cs="Arial"/>
-          <w:i/>
-          <w:szCs w:val="22"/>
-        </w:rPr>
-        <w:t>PiXY supports a consistent workflow from offline candidate generation to instrument</w:t>
+      <w:proofErr w:type="spellStart"/>
+      <w:r>
+        <w:rPr>
+          <w:rFonts w:ascii="Arial" w:eastAsia="Calibri" w:hAnsi="Arial" w:cs="Arial"/>
+          <w:i/>
+          <w:szCs w:val="22"/>
+        </w:rPr>
+        <w:t>PiXY</w:t>
+      </w:r>
+      <w:proofErr w:type="spellEnd"/>
+      <w:r>
+        <w:rPr>
+          <w:rFonts w:ascii="Arial" w:eastAsia="Calibri" w:hAnsi="Arial" w:cs="Arial"/>
+          <w:i/>
+          <w:szCs w:val="22"/>
+        </w:rPr>
+        <w:t xml:space="preserve"> supports a consistent workflow from offline candidate generation to instrument</w:t>
       </w:r>
       <w:r>
         <w:rPr>
@@ -2262,7 +2675,25 @@
           <w:i/>
           <w:szCs w:val="22"/>
         </w:rPr>
-        <w:t>means–based color segmentation and connected</w:t>
+        <w:t xml:space="preserve">means–based </w:t>
+      </w:r>
+      <w:proofErr w:type="spellStart"/>
+      <w:r>
+        <w:rPr>
+          <w:rFonts w:ascii="Arial" w:eastAsia="Calibri" w:hAnsi="Arial" w:cs="Arial"/>
+          <w:i/>
+          <w:szCs w:val="22"/>
+        </w:rPr>
+        <w:t>color</w:t>
+      </w:r>
+      <w:proofErr w:type="spellEnd"/>
+      <w:r>
+        <w:rPr>
+          <w:rFonts w:ascii="Arial" w:eastAsia="Calibri" w:hAnsi="Arial" w:cs="Arial"/>
+          <w:i/>
+          <w:szCs w:val="22"/>
+        </w:rPr>
+        <w:t xml:space="preserve"> segmentation and connected</w:t>
       </w:r>
       <w:r>
         <w:rPr>
@@ -2325,7 +2756,25 @@
           <w:i/>
           <w:szCs w:val="22"/>
         </w:rPr>
-        <w:t>Next, users mark repeatably identifiable sample features as fiducials on the image and enter the corresponding stage coordinates measured on the analytical instrument. PiXY estimates a 2D</w:t>
+        <w:t xml:space="preserve">Next, users mark repeatably identifiable sample features as fiducials on the image and enter the corresponding stage coordinates measured on the analytical instrument. </w:t>
+      </w:r>
+      <w:proofErr w:type="spellStart"/>
+      <w:r>
+        <w:rPr>
+          <w:rFonts w:ascii="Arial" w:eastAsia="Calibri" w:hAnsi="Arial" w:cs="Arial"/>
+          <w:i/>
+          <w:szCs w:val="22"/>
+        </w:rPr>
+        <w:t>PiXY</w:t>
+      </w:r>
+      <w:proofErr w:type="spellEnd"/>
+      <w:r>
+        <w:rPr>
+          <w:rFonts w:ascii="Arial" w:eastAsia="Calibri" w:hAnsi="Arial" w:cs="Arial"/>
+          <w:i/>
+          <w:szCs w:val="22"/>
+        </w:rPr>
+        <w:t xml:space="preserve"> estimates a 2D</w:t>
       </w:r>
       <w:r>
         <w:rPr>
@@ -2414,7 +2863,25 @@
           <w:i/>
           <w:szCs w:val="22"/>
         </w:rPr>
-        <w:t>estimation by adding or replacing fiducials. Using the estimated transform, PiXY converts candidate centroids into stage coordinates and exports them in convenient formats (CSV save, clipboard copy).</w:t>
+        <w:t xml:space="preserve">estimation by adding or replacing fiducials. Using the estimated transform, </w:t>
+      </w:r>
+      <w:proofErr w:type="spellStart"/>
+      <w:r>
+        <w:rPr>
+          <w:rFonts w:ascii="Arial" w:eastAsia="Calibri" w:hAnsi="Arial" w:cs="Arial"/>
+          <w:i/>
+          <w:szCs w:val="22"/>
+        </w:rPr>
+        <w:t>PiXY</w:t>
+      </w:r>
+      <w:proofErr w:type="spellEnd"/>
+      <w:r>
+        <w:rPr>
+          <w:rFonts w:ascii="Arial" w:eastAsia="Calibri" w:hAnsi="Arial" w:cs="Arial"/>
+          <w:i/>
+          <w:szCs w:val="22"/>
+        </w:rPr>
+        <w:t xml:space="preserve"> converts candidate centroids into stage coordinates and exports them in convenient formats (CSV save, clipboard copy).</w:t>
       </w:r>
     </w:p>
     <w:p>
@@ -2450,7 +2917,79 @@
           <w:i/>
           <w:szCs w:val="22"/>
         </w:rPr>
-        <w:t>identification, PiXY provides image rotation and flip operations. The analysis state can be saved and reloaded as a project file (.pixy), allowing integrated management of the image, processing settings, extraction results, fiducials, and transform outputs. The source code is publicly available on GitHub and is persistently archived on Zenodo (DOI: 10.5281/zenodo.18174474). PiXY can be run from Python by installing the dependencies listed in requirements.txt and launching Main.py; in addition, a standalone Windows executable built with PyInstaller is provided.</w:t>
+        <w:t xml:space="preserve">identification, </w:t>
+      </w:r>
+      <w:proofErr w:type="spellStart"/>
+      <w:r>
+        <w:rPr>
+          <w:rFonts w:ascii="Arial" w:eastAsia="Calibri" w:hAnsi="Arial" w:cs="Arial"/>
+          <w:i/>
+          <w:szCs w:val="22"/>
+        </w:rPr>
+        <w:t>PiXY</w:t>
+      </w:r>
+      <w:proofErr w:type="spellEnd"/>
+      <w:r>
+        <w:rPr>
+          <w:rFonts w:ascii="Arial" w:eastAsia="Calibri" w:hAnsi="Arial" w:cs="Arial"/>
+          <w:i/>
+          <w:szCs w:val="22"/>
+        </w:rPr>
+        <w:t xml:space="preserve"> provides image rotation and flip operations. The analysis state can be saved and reloaded as a project file (.pixy), allowing integrated management of the image, processing settings, extraction results, fiducials, and transform outputs. The source code is publicly available on GitHub and is persistently archived on </w:t>
+      </w:r>
+      <w:proofErr w:type="spellStart"/>
+      <w:r>
+        <w:rPr>
+          <w:rFonts w:ascii="Arial" w:eastAsia="Calibri" w:hAnsi="Arial" w:cs="Arial"/>
+          <w:i/>
+          <w:szCs w:val="22"/>
+        </w:rPr>
+        <w:t>Zenodo</w:t>
+      </w:r>
+      <w:proofErr w:type="spellEnd"/>
+      <w:r>
+        <w:rPr>
+          <w:rFonts w:ascii="Arial" w:eastAsia="Calibri" w:hAnsi="Arial" w:cs="Arial"/>
+          <w:i/>
+          <w:szCs w:val="22"/>
+        </w:rPr>
+        <w:t xml:space="preserve"> (DOI: 10.5281/zenodo.18174474). </w:t>
+      </w:r>
+      <w:proofErr w:type="spellStart"/>
+      <w:r>
+        <w:rPr>
+          <w:rFonts w:ascii="Arial" w:eastAsia="Calibri" w:hAnsi="Arial" w:cs="Arial"/>
+          <w:i/>
+          <w:szCs w:val="22"/>
+        </w:rPr>
+        <w:t>PiXY</w:t>
+      </w:r>
+      <w:proofErr w:type="spellEnd"/>
+      <w:r>
+        <w:rPr>
+          <w:rFonts w:ascii="Arial" w:eastAsia="Calibri" w:hAnsi="Arial" w:cs="Arial"/>
+          <w:i/>
+          <w:szCs w:val="22"/>
+        </w:rPr>
+        <w:t xml:space="preserve"> can be run from Python by installing the dependencies listed in requirements.txt and launching Main.py; in addition, a standalone Windows executable built with </w:t>
+      </w:r>
+      <w:proofErr w:type="spellStart"/>
+      <w:r>
+        <w:rPr>
+          <w:rFonts w:ascii="Arial" w:eastAsia="Calibri" w:hAnsi="Arial" w:cs="Arial"/>
+          <w:i/>
+          <w:szCs w:val="22"/>
+        </w:rPr>
+        <w:t>PyInstaller</w:t>
+      </w:r>
+      <w:proofErr w:type="spellEnd"/>
+      <w:r>
+        <w:rPr>
+          <w:rFonts w:ascii="Arial" w:eastAsia="Calibri" w:hAnsi="Arial" w:cs="Arial"/>
+          <w:i/>
+          <w:szCs w:val="22"/>
+        </w:rPr>
+        <w:t xml:space="preserve"> is provided.</w:t>
       </w:r>
     </w:p>
     <w:p>
@@ -2727,7 +3266,25 @@
           <w:i/>
           <w:szCs w:val="22"/>
         </w:rPr>
-        <w:t>Launch PiXY on a Windows PC. Because a demo image is loaded at startup, select “New Project” and load a pre</w:t>
+        <w:t xml:space="preserve">Launch </w:t>
+      </w:r>
+      <w:proofErr w:type="spellStart"/>
+      <w:r>
+        <w:rPr>
+          <w:rFonts w:ascii="Arial" w:eastAsia="Calibri" w:hAnsi="Arial" w:cs="Arial"/>
+          <w:i/>
+          <w:szCs w:val="22"/>
+        </w:rPr>
+        <w:t>PiXY</w:t>
+      </w:r>
+      <w:proofErr w:type="spellEnd"/>
+      <w:r>
+        <w:rPr>
+          <w:rFonts w:ascii="Arial" w:eastAsia="Calibri" w:hAnsi="Arial" w:cs="Arial"/>
+          <w:i/>
+          <w:szCs w:val="22"/>
+        </w:rPr>
+        <w:t xml:space="preserve"> on a Windows PC. Because a demo image is loaded at startup, select “New Project” and load a pre</w:t>
       </w:r>
       <w:r>
         <w:rPr>
@@ -2743,7 +3300,25 @@
           <w:i/>
           <w:szCs w:val="22"/>
         </w:rPr>
-        <w:t>acquired microscope image (e.g., a BSE image) into PiXY (Figure 2). After loading, particle recognition and centroid extraction run automatically, and particle regions and centroids are overlaid on the image.</w:t>
+        <w:t xml:space="preserve">acquired microscope image (e.g., a BSE image) into </w:t>
+      </w:r>
+      <w:proofErr w:type="spellStart"/>
+      <w:r>
+        <w:rPr>
+          <w:rFonts w:ascii="Arial" w:eastAsia="Calibri" w:hAnsi="Arial" w:cs="Arial"/>
+          <w:i/>
+          <w:szCs w:val="22"/>
+        </w:rPr>
+        <w:t>PiXY</w:t>
+      </w:r>
+      <w:proofErr w:type="spellEnd"/>
+      <w:r>
+        <w:rPr>
+          <w:rFonts w:ascii="Arial" w:eastAsia="Calibri" w:hAnsi="Arial" w:cs="Arial"/>
+          <w:i/>
+          <w:szCs w:val="22"/>
+        </w:rPr>
+        <w:t xml:space="preserve"> (Figure 2). After loading, particle recognition and centroid extraction run automatically, and particle regions and centroids are overlaid on the image.</w:t>
       </w:r>
     </w:p>
     <w:p>
@@ -2961,7 +3536,43 @@
           <w:i/>
           <w:szCs w:val="22"/>
         </w:rPr>
-        <w:t>Launch PiXY on a Windows PC. If possible, run PiXY on the instrument</w:t>
+        <w:t xml:space="preserve">Launch </w:t>
+      </w:r>
+      <w:proofErr w:type="spellStart"/>
+      <w:r>
+        <w:rPr>
+          <w:rFonts w:ascii="Arial" w:eastAsia="Calibri" w:hAnsi="Arial" w:cs="Arial"/>
+          <w:i/>
+          <w:szCs w:val="22"/>
+        </w:rPr>
+        <w:t>PiXY</w:t>
+      </w:r>
+      <w:proofErr w:type="spellEnd"/>
+      <w:r>
+        <w:rPr>
+          <w:rFonts w:ascii="Arial" w:eastAsia="Calibri" w:hAnsi="Arial" w:cs="Arial"/>
+          <w:i/>
+          <w:szCs w:val="22"/>
+        </w:rPr>
+        <w:t xml:space="preserve"> on a Windows PC. If possible, run </w:t>
+      </w:r>
+      <w:proofErr w:type="spellStart"/>
+      <w:r>
+        <w:rPr>
+          <w:rFonts w:ascii="Arial" w:eastAsia="Calibri" w:hAnsi="Arial" w:cs="Arial"/>
+          <w:i/>
+          <w:szCs w:val="22"/>
+        </w:rPr>
+        <w:t>PiXY</w:t>
+      </w:r>
+      <w:proofErr w:type="spellEnd"/>
+      <w:r>
+        <w:rPr>
+          <w:rFonts w:ascii="Arial" w:eastAsia="Calibri" w:hAnsi="Arial" w:cs="Arial"/>
+          <w:i/>
+          <w:szCs w:val="22"/>
+        </w:rPr>
+        <w:t xml:space="preserve"> on the instrument</w:t>
       </w:r>
       <w:r>
         <w:rPr>
@@ -3051,7 +3662,25 @@
           <w:szCs w:val="22"/>
         </w:rPr>
         <w:lastRenderedPageBreak/>
-        <w:t>On the analytical instrument, relocate the same features, measure stage coordinates (X, Y, Z), and enter them into the fiducial table. PiXY also provides image rotation/flip to assist fiducial identification.</w:t>
+        <w:t xml:space="preserve">On the analytical instrument, relocate the same features, measure stage coordinates (X, Y, Z), and enter them into the fiducial table. </w:t>
+      </w:r>
+      <w:proofErr w:type="spellStart"/>
+      <w:r>
+        <w:rPr>
+          <w:rFonts w:ascii="Arial" w:eastAsia="Calibri" w:hAnsi="Arial" w:cs="Arial"/>
+          <w:i/>
+          <w:szCs w:val="22"/>
+        </w:rPr>
+        <w:t>PiXY</w:t>
+      </w:r>
+      <w:proofErr w:type="spellEnd"/>
+      <w:r>
+        <w:rPr>
+          <w:rFonts w:ascii="Arial" w:eastAsia="Calibri" w:hAnsi="Arial" w:cs="Arial"/>
+          <w:i/>
+          <w:szCs w:val="22"/>
+        </w:rPr>
+        <w:t xml:space="preserve"> also provides image rotation/flip to assist fiducial identification.</w:t>
       </w:r>
     </w:p>
     <w:p>
@@ -3116,7 +3745,25 @@
           <w:i/>
           <w:szCs w:val="22"/>
         </w:rPr>
-        <w:t>After entry, PiXY estimates the coordinate transform by least squares from multiple fiducial pairs and displays per</w:t>
+        <w:t xml:space="preserve">After entry, </w:t>
+      </w:r>
+      <w:proofErr w:type="spellStart"/>
+      <w:r>
+        <w:rPr>
+          <w:rFonts w:ascii="Arial" w:eastAsia="Calibri" w:hAnsi="Arial" w:cs="Arial"/>
+          <w:i/>
+          <w:szCs w:val="22"/>
+        </w:rPr>
+        <w:t>PiXY</w:t>
+      </w:r>
+      <w:proofErr w:type="spellEnd"/>
+      <w:r>
+        <w:rPr>
+          <w:rFonts w:ascii="Arial" w:eastAsia="Calibri" w:hAnsi="Arial" w:cs="Arial"/>
+          <w:i/>
+          <w:szCs w:val="22"/>
+        </w:rPr>
+        <w:t xml:space="preserve"> estimates the coordinate transform by least squares from multiple fiducial pairs and displays per</w:t>
       </w:r>
       <w:r>
         <w:rPr>
@@ -3351,7 +3998,25 @@
           <w:i/>
           <w:szCs w:val="22"/>
         </w:rPr>
-        <w:t xml:space="preserve">igure 2: Workflow in PiXY (image loading </w:t>
+        <w:t xml:space="preserve">igure 2: Workflow in </w:t>
+      </w:r>
+      <w:proofErr w:type="spellStart"/>
+      <w:r>
+        <w:rPr>
+          <w:rFonts w:ascii="Arial" w:eastAsia="Calibri" w:hAnsi="Arial" w:cs="Arial" w:hint="eastAsia"/>
+          <w:i/>
+          <w:szCs w:val="22"/>
+        </w:rPr>
+        <w:t>PiXY</w:t>
+      </w:r>
+      <w:proofErr w:type="spellEnd"/>
+      <w:r>
+        <w:rPr>
+          <w:rFonts w:ascii="Arial" w:eastAsia="Calibri" w:hAnsi="Arial" w:cs="Arial" w:hint="eastAsia"/>
+          <w:i/>
+          <w:szCs w:val="22"/>
+        </w:rPr>
+        <w:t xml:space="preserve"> (image loading </w:t>
       </w:r>
       <w:r>
         <w:rPr>
@@ -3506,7 +4171,25 @@
           <w:i/>
           <w:szCs w:val="22"/>
         </w:rPr>
-        <w:t>We validated PiXY’s coordinate transformation using real specimens and microanalysis instruments. BSE images were acquired with a scanning electron microscope (JEOL JSM</w:t>
+        <w:t xml:space="preserve">We validated </w:t>
+      </w:r>
+      <w:proofErr w:type="spellStart"/>
+      <w:r>
+        <w:rPr>
+          <w:rFonts w:ascii="Arial" w:eastAsia="Calibri" w:hAnsi="Arial" w:cs="Arial"/>
+          <w:i/>
+          <w:szCs w:val="22"/>
+        </w:rPr>
+        <w:t>PiXY’s</w:t>
+      </w:r>
+      <w:proofErr w:type="spellEnd"/>
+      <w:r>
+        <w:rPr>
+          <w:rFonts w:ascii="Arial" w:eastAsia="Calibri" w:hAnsi="Arial" w:cs="Arial"/>
+          <w:i/>
+          <w:szCs w:val="22"/>
+        </w:rPr>
+        <w:t xml:space="preserve"> coordinate transformation using real specimens and microanalysis instruments. BSE images were acquired with a scanning electron microscope (JEOL JSM</w:t>
       </w:r>
       <w:r>
         <w:rPr>
@@ -3538,7 +4221,61 @@
           <w:i/>
           <w:szCs w:val="22"/>
         </w:rPr>
-        <w:t>ablation system (Raijin; Seishin Shoji). A representative dataset was obtained at 15× magnification (1560 × 1920 pixels; 3.33 μm/pixel) from a polished epoxy mount. For fiducials, stage coordinates were recorded on the instrument while repeatedly relocating the same features; XY positions were read when the feature was centered, and Z was recorded after focus adjustment (autofocus or equivalent).</w:t>
+        <w:t xml:space="preserve">ablation system (Raijin; </w:t>
+      </w:r>
+      <w:proofErr w:type="spellStart"/>
+      <w:r>
+        <w:rPr>
+          <w:rFonts w:ascii="Arial" w:eastAsia="Calibri" w:hAnsi="Arial" w:cs="Arial"/>
+          <w:i/>
+          <w:szCs w:val="22"/>
+        </w:rPr>
+        <w:t>Seishin</w:t>
+      </w:r>
+      <w:proofErr w:type="spellEnd"/>
+      <w:r>
+        <w:rPr>
+          <w:rFonts w:ascii="Arial" w:eastAsia="Calibri" w:hAnsi="Arial" w:cs="Arial"/>
+          <w:i/>
+          <w:szCs w:val="22"/>
+        </w:rPr>
+        <w:t xml:space="preserve"> Shoji). A representative dataset was obtained at 15× magnification (1560 × 1920 pixels; 3.33 </w:t>
+      </w:r>
+      <w:proofErr w:type="spellStart"/>
+      <w:r>
+        <w:rPr>
+          <w:rFonts w:ascii="Arial" w:eastAsia="Calibri" w:hAnsi="Arial" w:cs="Arial"/>
+          <w:i/>
+          <w:szCs w:val="22"/>
+        </w:rPr>
+        <w:t>μm</w:t>
+      </w:r>
+      <w:proofErr w:type="spellEnd"/>
+      <w:r>
+        <w:rPr>
+          <w:rFonts w:ascii="Arial" w:eastAsia="Calibri" w:hAnsi="Arial" w:cs="Arial"/>
+          <w:i/>
+          <w:szCs w:val="22"/>
+        </w:rPr>
+        <w:t xml:space="preserve">/pixel) from a polished epoxy mount. For fiducials, stage coordinates were recorded on the instrument while repeatedly relocating the same features; XY positions were read when the feature was </w:t>
+      </w:r>
+      <w:proofErr w:type="spellStart"/>
+      <w:r>
+        <w:rPr>
+          <w:rFonts w:ascii="Arial" w:eastAsia="Calibri" w:hAnsi="Arial" w:cs="Arial"/>
+          <w:i/>
+          <w:szCs w:val="22"/>
+        </w:rPr>
+        <w:t>centered</w:t>
+      </w:r>
+      <w:proofErr w:type="spellEnd"/>
+      <w:r>
+        <w:rPr>
+          <w:rFonts w:ascii="Arial" w:eastAsia="Calibri" w:hAnsi="Arial" w:cs="Arial"/>
+          <w:i/>
+          <w:szCs w:val="22"/>
+        </w:rPr>
+        <w:t>, and Z was recorded after focus adjustment (autofocus or equivalent).</w:t>
       </w:r>
     </w:p>
     <w:p>
@@ -3569,7 +4306,115 @@
           <w:szCs w:val="22"/>
         </w:rPr>
         <w:lastRenderedPageBreak/>
-        <w:t>For evaluation, the BSE image was loaded into PiXY and centroids were extracted using standard parameters (K = 5; minimum area 20 px; maximum area 4000 px). Fiducials were chosen near the mount rim to sufficiently constrain the transform; two configurations were compared: three fiducials (approximately 120° spacing) and five fiducials (approximately 70° spacing). After estimating the transform, stage coordinates exported by PiXY were sent to the instrument to move the stage. The difference between intended and reached positions was evaluated as residuals. Measurement points spanned approximately 5000 μm in X and Y and 100–400 μm in Z.</w:t>
+        <w:t xml:space="preserve">For evaluation, the BSE image was loaded into </w:t>
+      </w:r>
+      <w:proofErr w:type="spellStart"/>
+      <w:r>
+        <w:rPr>
+          <w:rFonts w:ascii="Arial" w:eastAsia="Calibri" w:hAnsi="Arial" w:cs="Arial"/>
+          <w:i/>
+          <w:szCs w:val="22"/>
+        </w:rPr>
+        <w:t>PiXY</w:t>
+      </w:r>
+      <w:proofErr w:type="spellEnd"/>
+      <w:r>
+        <w:rPr>
+          <w:rFonts w:ascii="Arial" w:eastAsia="Calibri" w:hAnsi="Arial" w:cs="Arial"/>
+          <w:i/>
+          <w:szCs w:val="22"/>
+        </w:rPr>
+        <w:t xml:space="preserve"> and centroids were extracted using standard parameters (K = 5; minimum area 20 </w:t>
+      </w:r>
+      <w:proofErr w:type="spellStart"/>
+      <w:r>
+        <w:rPr>
+          <w:rFonts w:ascii="Arial" w:eastAsia="Calibri" w:hAnsi="Arial" w:cs="Arial"/>
+          <w:i/>
+          <w:szCs w:val="22"/>
+        </w:rPr>
+        <w:t>px</w:t>
+      </w:r>
+      <w:proofErr w:type="spellEnd"/>
+      <w:r>
+        <w:rPr>
+          <w:rFonts w:ascii="Arial" w:eastAsia="Calibri" w:hAnsi="Arial" w:cs="Arial"/>
+          <w:i/>
+          <w:szCs w:val="22"/>
+        </w:rPr>
+        <w:t xml:space="preserve">; maximum area 4000 </w:t>
+      </w:r>
+      <w:proofErr w:type="spellStart"/>
+      <w:r>
+        <w:rPr>
+          <w:rFonts w:ascii="Arial" w:eastAsia="Calibri" w:hAnsi="Arial" w:cs="Arial"/>
+          <w:i/>
+          <w:szCs w:val="22"/>
+        </w:rPr>
+        <w:t>px</w:t>
+      </w:r>
+      <w:proofErr w:type="spellEnd"/>
+      <w:r>
+        <w:rPr>
+          <w:rFonts w:ascii="Arial" w:eastAsia="Calibri" w:hAnsi="Arial" w:cs="Arial"/>
+          <w:i/>
+          <w:szCs w:val="22"/>
+        </w:rPr>
+        <w:t xml:space="preserve">). Fiducials were chosen near the mount rim to sufficiently constrain the transform; two configurations were compared: three fiducials (approximately 120° spacing) and five fiducials (approximately 70° spacing). After estimating the transform, stage coordinates exported by </w:t>
+      </w:r>
+      <w:proofErr w:type="spellStart"/>
+      <w:r>
+        <w:rPr>
+          <w:rFonts w:ascii="Arial" w:eastAsia="Calibri" w:hAnsi="Arial" w:cs="Arial"/>
+          <w:i/>
+          <w:szCs w:val="22"/>
+        </w:rPr>
+        <w:t>PiXY</w:t>
+      </w:r>
+      <w:proofErr w:type="spellEnd"/>
+      <w:r>
+        <w:rPr>
+          <w:rFonts w:ascii="Arial" w:eastAsia="Calibri" w:hAnsi="Arial" w:cs="Arial"/>
+          <w:i/>
+          <w:szCs w:val="22"/>
+        </w:rPr>
+        <w:t xml:space="preserve"> were sent to the instrument to move the stage. The difference between intended and reached positions was evaluated as residuals. Measurement points spanned approximately 5000 </w:t>
+      </w:r>
+      <w:proofErr w:type="spellStart"/>
+      <w:r>
+        <w:rPr>
+          <w:rFonts w:ascii="Arial" w:eastAsia="Calibri" w:hAnsi="Arial" w:cs="Arial"/>
+          <w:i/>
+          <w:szCs w:val="22"/>
+        </w:rPr>
+        <w:t>μm</w:t>
+      </w:r>
+      <w:proofErr w:type="spellEnd"/>
+      <w:r>
+        <w:rPr>
+          <w:rFonts w:ascii="Arial" w:eastAsia="Calibri" w:hAnsi="Arial" w:cs="Arial"/>
+          <w:i/>
+          <w:szCs w:val="22"/>
+        </w:rPr>
+        <w:t xml:space="preserve"> in X and Y and 100–400 </w:t>
+      </w:r>
+      <w:proofErr w:type="spellStart"/>
+      <w:r>
+        <w:rPr>
+          <w:rFonts w:ascii="Arial" w:eastAsia="Calibri" w:hAnsi="Arial" w:cs="Arial"/>
+          <w:i/>
+          <w:szCs w:val="22"/>
+        </w:rPr>
+        <w:t>μm</w:t>
+      </w:r>
+      <w:proofErr w:type="spellEnd"/>
+      <w:r>
+        <w:rPr>
+          <w:rFonts w:ascii="Arial" w:eastAsia="Calibri" w:hAnsi="Arial" w:cs="Arial"/>
+          <w:i/>
+          <w:szCs w:val="22"/>
+        </w:rPr>
+        <w:t xml:space="preserve"> in Z.</w:t>
       </w:r>
     </w:p>
     <w:p>
@@ -3602,6 +4447,7 @@
         </w:rPr>
         <w:t xml:space="preserve">Each configuration was evaluated in three runs with different sample orientations (rotation/tilt). In each run, 30–40 target points were measured, yielding N = 100 residuals per configuration (Figure 3). With five fiducials, 50% of residuals were within 3 </w:t>
       </w:r>
+      <w:proofErr w:type="spellStart"/>
       <w:r>
         <w:rPr>
           <w:rFonts w:ascii="Arial" w:eastAsia="Calibri" w:hAnsi="Arial" w:cs="Arial" w:hint="eastAsia"/>
@@ -3616,7 +4462,214 @@
           <w:i/>
           <w:szCs w:val="22"/>
         </w:rPr>
-        <w:t>m (X), 3 μm (Y), and 4 μm (Z), and 90% were within 10 μm (X), 16 μm (Y), and 21 μm (Z). With three fiducials, 50% were within 11 μm, 12 μm, and 6 μm, and 90% were within 32 μm, 42 μm, and 20 μm, for X, Y, and Z, respectively. In general, increasing the number of fiducials strengthens the least</w:t>
+        <w:t>m</w:t>
+      </w:r>
+      <w:proofErr w:type="spellEnd"/>
+      <w:r>
+        <w:rPr>
+          <w:rFonts w:ascii="Arial" w:eastAsia="Calibri" w:hAnsi="Arial" w:cs="Arial"/>
+          <w:i/>
+          <w:szCs w:val="22"/>
+        </w:rPr>
+        <w:t xml:space="preserve"> (X), 3 </w:t>
+      </w:r>
+      <w:proofErr w:type="spellStart"/>
+      <w:r>
+        <w:rPr>
+          <w:rFonts w:ascii="Arial" w:eastAsia="Calibri" w:hAnsi="Arial" w:cs="Arial"/>
+          <w:i/>
+          <w:szCs w:val="22"/>
+        </w:rPr>
+        <w:t>μm</w:t>
+      </w:r>
+      <w:proofErr w:type="spellEnd"/>
+      <w:r>
+        <w:rPr>
+          <w:rFonts w:ascii="Arial" w:eastAsia="Calibri" w:hAnsi="Arial" w:cs="Arial"/>
+          <w:i/>
+          <w:szCs w:val="22"/>
+        </w:rPr>
+        <w:t xml:space="preserve"> (Y), and 4 </w:t>
+      </w:r>
+      <w:proofErr w:type="spellStart"/>
+      <w:r>
+        <w:rPr>
+          <w:rFonts w:ascii="Arial" w:eastAsia="Calibri" w:hAnsi="Arial" w:cs="Arial"/>
+          <w:i/>
+          <w:szCs w:val="22"/>
+        </w:rPr>
+        <w:t>μm</w:t>
+      </w:r>
+      <w:proofErr w:type="spellEnd"/>
+      <w:r>
+        <w:rPr>
+          <w:rFonts w:ascii="Arial" w:eastAsia="Calibri" w:hAnsi="Arial" w:cs="Arial"/>
+          <w:i/>
+          <w:szCs w:val="22"/>
+        </w:rPr>
+        <w:t xml:space="preserve"> (Z), and 90% were within 10 </w:t>
+      </w:r>
+      <w:proofErr w:type="spellStart"/>
+      <w:r>
+        <w:rPr>
+          <w:rFonts w:ascii="Arial" w:eastAsia="Calibri" w:hAnsi="Arial" w:cs="Arial"/>
+          <w:i/>
+          <w:szCs w:val="22"/>
+        </w:rPr>
+        <w:t>μm</w:t>
+      </w:r>
+      <w:proofErr w:type="spellEnd"/>
+      <w:r>
+        <w:rPr>
+          <w:rFonts w:ascii="Arial" w:eastAsia="Calibri" w:hAnsi="Arial" w:cs="Arial"/>
+          <w:i/>
+          <w:szCs w:val="22"/>
+        </w:rPr>
+        <w:t xml:space="preserve"> (X), 16 </w:t>
+      </w:r>
+      <w:proofErr w:type="spellStart"/>
+      <w:r>
+        <w:rPr>
+          <w:rFonts w:ascii="Arial" w:eastAsia="Calibri" w:hAnsi="Arial" w:cs="Arial"/>
+          <w:i/>
+          <w:szCs w:val="22"/>
+        </w:rPr>
+        <w:t>μm</w:t>
+      </w:r>
+      <w:proofErr w:type="spellEnd"/>
+      <w:r>
+        <w:rPr>
+          <w:rFonts w:ascii="Arial" w:eastAsia="Calibri" w:hAnsi="Arial" w:cs="Arial"/>
+          <w:i/>
+          <w:szCs w:val="22"/>
+        </w:rPr>
+        <w:t xml:space="preserve"> (Y), and 21 </w:t>
+      </w:r>
+      <w:proofErr w:type="spellStart"/>
+      <w:r>
+        <w:rPr>
+          <w:rFonts w:ascii="Arial" w:eastAsia="Calibri" w:hAnsi="Arial" w:cs="Arial"/>
+          <w:i/>
+          <w:szCs w:val="22"/>
+        </w:rPr>
+        <w:t>μm</w:t>
+      </w:r>
+      <w:proofErr w:type="spellEnd"/>
+      <w:r>
+        <w:rPr>
+          <w:rFonts w:ascii="Arial" w:eastAsia="Calibri" w:hAnsi="Arial" w:cs="Arial"/>
+          <w:i/>
+          <w:szCs w:val="22"/>
+        </w:rPr>
+        <w:t xml:space="preserve"> (Z). With three fiducials, 50% were within 11 </w:t>
+      </w:r>
+      <w:proofErr w:type="spellStart"/>
+      <w:r>
+        <w:rPr>
+          <w:rFonts w:ascii="Arial" w:eastAsia="Calibri" w:hAnsi="Arial" w:cs="Arial"/>
+          <w:i/>
+          <w:szCs w:val="22"/>
+        </w:rPr>
+        <w:t>μm</w:t>
+      </w:r>
+      <w:proofErr w:type="spellEnd"/>
+      <w:r>
+        <w:rPr>
+          <w:rFonts w:ascii="Arial" w:eastAsia="Calibri" w:hAnsi="Arial" w:cs="Arial"/>
+          <w:i/>
+          <w:szCs w:val="22"/>
+        </w:rPr>
+        <w:t xml:space="preserve">, 12 </w:t>
+      </w:r>
+      <w:proofErr w:type="spellStart"/>
+      <w:r>
+        <w:rPr>
+          <w:rFonts w:ascii="Arial" w:eastAsia="Calibri" w:hAnsi="Arial" w:cs="Arial"/>
+          <w:i/>
+          <w:szCs w:val="22"/>
+        </w:rPr>
+        <w:t>μm</w:t>
+      </w:r>
+      <w:proofErr w:type="spellEnd"/>
+      <w:r>
+        <w:rPr>
+          <w:rFonts w:ascii="Arial" w:eastAsia="Calibri" w:hAnsi="Arial" w:cs="Arial"/>
+          <w:i/>
+          <w:szCs w:val="22"/>
+        </w:rPr>
+        <w:t xml:space="preserve">, and 6 </w:t>
+      </w:r>
+      <w:proofErr w:type="spellStart"/>
+      <w:r>
+        <w:rPr>
+          <w:rFonts w:ascii="Arial" w:eastAsia="Calibri" w:hAnsi="Arial" w:cs="Arial"/>
+          <w:i/>
+          <w:szCs w:val="22"/>
+        </w:rPr>
+        <w:t>μm</w:t>
+      </w:r>
+      <w:proofErr w:type="spellEnd"/>
+      <w:r>
+        <w:rPr>
+          <w:rFonts w:ascii="Arial" w:eastAsia="Calibri" w:hAnsi="Arial" w:cs="Arial"/>
+          <w:i/>
+          <w:szCs w:val="22"/>
+        </w:rPr>
+        <w:t xml:space="preserve">, and 90% were within 32 </w:t>
+      </w:r>
+      <w:proofErr w:type="spellStart"/>
+      <w:r>
+        <w:rPr>
+          <w:rFonts w:ascii="Arial" w:eastAsia="Calibri" w:hAnsi="Arial" w:cs="Arial"/>
+          <w:i/>
+          <w:szCs w:val="22"/>
+        </w:rPr>
+        <w:t>μm</w:t>
+      </w:r>
+      <w:proofErr w:type="spellEnd"/>
+      <w:r>
+        <w:rPr>
+          <w:rFonts w:ascii="Arial" w:eastAsia="Calibri" w:hAnsi="Arial" w:cs="Arial"/>
+          <w:i/>
+          <w:szCs w:val="22"/>
+        </w:rPr>
+        <w:t xml:space="preserve">, 42 </w:t>
+      </w:r>
+      <w:proofErr w:type="spellStart"/>
+      <w:r>
+        <w:rPr>
+          <w:rFonts w:ascii="Arial" w:eastAsia="Calibri" w:hAnsi="Arial" w:cs="Arial"/>
+          <w:i/>
+          <w:szCs w:val="22"/>
+        </w:rPr>
+        <w:t>μm</w:t>
+      </w:r>
+      <w:proofErr w:type="spellEnd"/>
+      <w:r>
+        <w:rPr>
+          <w:rFonts w:ascii="Arial" w:eastAsia="Calibri" w:hAnsi="Arial" w:cs="Arial"/>
+          <w:i/>
+          <w:szCs w:val="22"/>
+        </w:rPr>
+        <w:t xml:space="preserve">, and 20 </w:t>
+      </w:r>
+      <w:proofErr w:type="spellStart"/>
+      <w:r>
+        <w:rPr>
+          <w:rFonts w:ascii="Arial" w:eastAsia="Calibri" w:hAnsi="Arial" w:cs="Arial"/>
+          <w:i/>
+          <w:szCs w:val="22"/>
+        </w:rPr>
+        <w:t>μm</w:t>
+      </w:r>
+      <w:proofErr w:type="spellEnd"/>
+      <w:r>
+        <w:rPr>
+          <w:rFonts w:ascii="Arial" w:eastAsia="Calibri" w:hAnsi="Arial" w:cs="Arial"/>
+          <w:i/>
+          <w:szCs w:val="22"/>
+        </w:rPr>
+        <w:t>, for X, Y, and Z, respectively. In general, increasing the number of fiducials strengthens the least</w:t>
       </w:r>
       <w:r>
         <w:rPr>
@@ -3842,7 +4895,25 @@
           <w:szCs w:val="22"/>
           <w:lang w:eastAsia="ja-JP"/>
         </w:rPr>
-        <w:t>The primary impact of PiXY is shifting the targeting step in microanalysis from on</w:t>
+        <w:t xml:space="preserve">The primary impact of </w:t>
+      </w:r>
+      <w:proofErr w:type="spellStart"/>
+      <w:r>
+        <w:rPr>
+          <w:rFonts w:ascii="Arial" w:hAnsi="Arial" w:cs="Arial"/>
+          <w:szCs w:val="22"/>
+          <w:lang w:eastAsia="ja-JP"/>
+        </w:rPr>
+        <w:t>PiXY</w:t>
+      </w:r>
+      <w:proofErr w:type="spellEnd"/>
+      <w:r>
+        <w:rPr>
+          <w:rFonts w:ascii="Arial" w:hAnsi="Arial" w:cs="Arial"/>
+          <w:szCs w:val="22"/>
+          <w:lang w:eastAsia="ja-JP"/>
+        </w:rPr>
+        <w:t xml:space="preserve"> is shifting the targeting step in microanalysis from on</w:t>
       </w:r>
       <w:r>
         <w:rPr>
@@ -3874,8 +4945,18 @@
           <w:szCs w:val="22"/>
           <w:lang w:eastAsia="ja-JP"/>
         </w:rPr>
-        <w:t>identification that often limits machine time. On analytical instruments with limited fields of view, exploring and positioning micrometer</w:t>
-      </w:r>
+        <w:t xml:space="preserve">identification that often limits machine time. On analytical instruments with limited fields of view, exploring and positioning </w:t>
+      </w:r>
+      <w:proofErr w:type="spellStart"/>
+      <w:r>
+        <w:rPr>
+          <w:rFonts w:ascii="Arial" w:hAnsi="Arial" w:cs="Arial"/>
+          <w:szCs w:val="22"/>
+          <w:lang w:eastAsia="ja-JP"/>
+        </w:rPr>
+        <w:t>micrometer</w:t>
+      </w:r>
+      <w:proofErr w:type="spellEnd"/>
       <w:r>
         <w:rPr>
           <w:rFonts w:ascii="Cambria Math" w:hAnsi="Cambria Math" w:cs="Cambria Math"/>
@@ -3938,7 +5019,25 @@
           <w:szCs w:val="22"/>
           <w:lang w:eastAsia="ja-JP"/>
         </w:rPr>
-        <w:t>prone, particularly when many targets must be located. PiXY integrates candidate generation (centroid extraction) on pre</w:t>
+        <w:t xml:space="preserve">prone, particularly when many targets must be located. </w:t>
+      </w:r>
+      <w:proofErr w:type="spellStart"/>
+      <w:r>
+        <w:rPr>
+          <w:rFonts w:ascii="Arial" w:hAnsi="Arial" w:cs="Arial"/>
+          <w:szCs w:val="22"/>
+          <w:lang w:eastAsia="ja-JP"/>
+        </w:rPr>
+        <w:t>PiXY</w:t>
+      </w:r>
+      <w:proofErr w:type="spellEnd"/>
+      <w:r>
+        <w:rPr>
+          <w:rFonts w:ascii="Arial" w:hAnsi="Arial" w:cs="Arial"/>
+          <w:szCs w:val="22"/>
+          <w:lang w:eastAsia="ja-JP"/>
+        </w:rPr>
+        <w:t xml:space="preserve"> integrates candidate generation (centroid extraction) on pre</w:t>
       </w:r>
       <w:r>
         <w:rPr>
@@ -4023,35 +5122,125 @@
           <w:szCs w:val="22"/>
           <w:lang w:eastAsia="ja-JP"/>
         </w:rPr>
-        <w:t>(1) New research questions enabled: By making it straightforward to prepare large numbers of measurement candidates before instrument loading, PiXY supports a shift from “a small number of representative spots” to “statistical evaluations over many spots.” Examples include dense sampling of particle populations and phase boundaries, sampling strategies informed by particle size/shape/composition correlations, and systematic evaluation of how fiducial placement and the number of fiducials affect residuals (optimization of fiducial operations). Compared with automatic registration approaches that rely on dedicated markers (e.g., autoCRIM [1]), PiXY assumes operation without dedicated markers and focuses on workflow optimization under practical constraints.</w:t>
-      </w:r>
-    </w:p>
-    <w:p>
-      <w:pPr>
-        <w:spacing w:after="0" w:line="240" w:lineRule="auto"/>
-        <w:rPr>
-          <w:rFonts w:ascii="Arial" w:hAnsi="Arial" w:cs="Arial"/>
-          <w:szCs w:val="22"/>
-          <w:lang w:eastAsia="ja-JP"/>
-        </w:rPr>
-      </w:pPr>
-    </w:p>
-    <w:p>
-      <w:pPr>
-        <w:spacing w:after="0" w:line="240" w:lineRule="auto"/>
-        <w:rPr>
-          <w:rFonts w:ascii="Arial" w:hAnsi="Arial" w:cs="Arial"/>
-          <w:szCs w:val="22"/>
-          <w:lang w:eastAsia="ja-JP"/>
-        </w:rPr>
-      </w:pPr>
-      <w:r>
-        <w:rPr>
-          <w:rFonts w:ascii="Arial" w:hAnsi="Arial" w:cs="Arial"/>
-          <w:szCs w:val="22"/>
-          <w:lang w:eastAsia="ja-JP"/>
-        </w:rPr>
-        <w:t>(2) Improvements over existing practice: In many microanalysis workflows, relocation is a bottleneck that constrains the number of measured points and reduces instrument efficiency. PiXY (i) automatically generates candidates on the image, (ii) allows the use of four or more fiducials to better constrain least</w:t>
+        <w:t xml:space="preserve">(1) New research questions enabled: By making it straightforward to prepare large numbers of measurement candidates before instrument loading, </w:t>
+      </w:r>
+      <w:proofErr w:type="spellStart"/>
+      <w:r>
+        <w:rPr>
+          <w:rFonts w:ascii="Arial" w:hAnsi="Arial" w:cs="Arial"/>
+          <w:szCs w:val="22"/>
+          <w:lang w:eastAsia="ja-JP"/>
+        </w:rPr>
+        <w:t>PiXY</w:t>
+      </w:r>
+      <w:proofErr w:type="spellEnd"/>
+      <w:r>
+        <w:rPr>
+          <w:rFonts w:ascii="Arial" w:hAnsi="Arial" w:cs="Arial"/>
+          <w:szCs w:val="22"/>
+          <w:lang w:eastAsia="ja-JP"/>
+        </w:rPr>
+        <w:t xml:space="preserve"> supports a shift from “a small number of representative spots” to “statistical evaluations over many spots.” Examples include dense sampling of particle populations and phase boundaries, sampling strategies informed by particle size/shape/composition correlations, and systematic evaluation of how fiducial placement and the number of fiducials affect residuals (optimization of fiducial operations). Compared with automatic registration approaches that rely on dedicated markers (e.g., </w:t>
+      </w:r>
+      <w:proofErr w:type="spellStart"/>
+      <w:r>
+        <w:rPr>
+          <w:rFonts w:ascii="Arial" w:hAnsi="Arial" w:cs="Arial"/>
+          <w:szCs w:val="22"/>
+          <w:lang w:eastAsia="ja-JP"/>
+        </w:rPr>
+        <w:t>autoCRIM</w:t>
+      </w:r>
+      <w:proofErr w:type="spellEnd"/>
+      <w:r>
+        <w:rPr>
+          <w:rFonts w:ascii="Arial" w:hAnsi="Arial" w:cs="Arial"/>
+          <w:szCs w:val="22"/>
+          <w:lang w:eastAsia="ja-JP"/>
+        </w:rPr>
+        <w:t xml:space="preserve"> [1]), </w:t>
+      </w:r>
+      <w:proofErr w:type="spellStart"/>
+      <w:r>
+        <w:rPr>
+          <w:rFonts w:ascii="Arial" w:hAnsi="Arial" w:cs="Arial"/>
+          <w:szCs w:val="22"/>
+          <w:lang w:eastAsia="ja-JP"/>
+        </w:rPr>
+        <w:t>PiXY</w:t>
+      </w:r>
+      <w:proofErr w:type="spellEnd"/>
+      <w:r>
+        <w:rPr>
+          <w:rFonts w:ascii="Arial" w:hAnsi="Arial" w:cs="Arial"/>
+          <w:szCs w:val="22"/>
+          <w:lang w:eastAsia="ja-JP"/>
+        </w:rPr>
+        <w:t xml:space="preserve"> assumes operation without dedicated markers and focuses on workflow optimization under practical constraints.</w:t>
+      </w:r>
+    </w:p>
+    <w:p>
+      <w:pPr>
+        <w:spacing w:after="0" w:line="240" w:lineRule="auto"/>
+        <w:rPr>
+          <w:rFonts w:ascii="Arial" w:hAnsi="Arial" w:cs="Arial"/>
+          <w:szCs w:val="22"/>
+          <w:lang w:eastAsia="ja-JP"/>
+        </w:rPr>
+      </w:pPr>
+    </w:p>
+    <w:p>
+      <w:pPr>
+        <w:spacing w:after="0" w:line="240" w:lineRule="auto"/>
+        <w:rPr>
+          <w:rFonts w:ascii="Arial" w:hAnsi="Arial" w:cs="Arial"/>
+          <w:szCs w:val="22"/>
+          <w:lang w:eastAsia="ja-JP"/>
+        </w:rPr>
+      </w:pPr>
+      <w:r>
+        <w:rPr>
+          <w:rFonts w:ascii="Arial" w:hAnsi="Arial" w:cs="Arial"/>
+          <w:szCs w:val="22"/>
+          <w:lang w:eastAsia="ja-JP"/>
+        </w:rPr>
+        <w:t xml:space="preserve">(2) Improvements over existing practice: In many microanalysis workflows, relocation is a bottleneck that constrains the number of measured points and reduces instrument efficiency. </w:t>
+      </w:r>
+      <w:proofErr w:type="spellStart"/>
+      <w:r>
+        <w:rPr>
+          <w:rFonts w:ascii="Arial" w:hAnsi="Arial" w:cs="Arial"/>
+          <w:szCs w:val="22"/>
+          <w:lang w:eastAsia="ja-JP"/>
+        </w:rPr>
+        <w:t>PiXY</w:t>
+      </w:r>
+      <w:proofErr w:type="spellEnd"/>
+      <w:r>
+        <w:rPr>
+          <w:rFonts w:ascii="Arial" w:hAnsi="Arial" w:cs="Arial"/>
+          <w:szCs w:val="22"/>
+          <w:lang w:eastAsia="ja-JP"/>
+        </w:rPr>
+        <w:t xml:space="preserve"> (</w:t>
+      </w:r>
+      <w:proofErr w:type="spellStart"/>
+      <w:r>
+        <w:rPr>
+          <w:rFonts w:ascii="Arial" w:hAnsi="Arial" w:cs="Arial"/>
+          <w:szCs w:val="22"/>
+          <w:lang w:eastAsia="ja-JP"/>
+        </w:rPr>
+        <w:t>i</w:t>
+      </w:r>
+      <w:proofErr w:type="spellEnd"/>
+      <w:r>
+        <w:rPr>
+          <w:rFonts w:ascii="Arial" w:hAnsi="Arial" w:cs="Arial"/>
+          <w:szCs w:val="22"/>
+          <w:lang w:eastAsia="ja-JP"/>
+        </w:rPr>
+        <w:t>) automatically generates candidates on the image, (ii) allows the use of four or more fiducials to better constrain least</w:t>
       </w:r>
       <w:r>
         <w:rPr>
@@ -4131,35 +5320,161 @@
           <w:szCs w:val="22"/>
           <w:lang w:eastAsia="ja-JP"/>
         </w:rPr>
-        <w:t>error into offline work. In validation (Section 3.3), with five fiducials, 50% of residuals were within 3 μm (X), 3 μm (Y), and 4 μm (Z), and 90% were within 10 μm (X), 16 μm (Y), and 21 μm (Z), indicating practical accuracy and showing that increasing fiducials improves residual distributions.</w:t>
-      </w:r>
-    </w:p>
-    <w:p>
-      <w:pPr>
-        <w:spacing w:after="0" w:line="240" w:lineRule="auto"/>
-        <w:rPr>
-          <w:rFonts w:ascii="Arial" w:hAnsi="Arial" w:cs="Arial"/>
-          <w:szCs w:val="22"/>
-          <w:lang w:eastAsia="ja-JP"/>
-        </w:rPr>
-      </w:pPr>
-    </w:p>
-    <w:p>
-      <w:pPr>
-        <w:spacing w:after="0" w:line="240" w:lineRule="auto"/>
-        <w:rPr>
-          <w:rFonts w:ascii="Arial" w:hAnsi="Arial" w:cs="Arial"/>
-          <w:szCs w:val="22"/>
-          <w:lang w:eastAsia="ja-JP"/>
-        </w:rPr>
-      </w:pPr>
-      <w:r>
-        <w:rPr>
-          <w:rFonts w:ascii="Arial" w:hAnsi="Arial" w:cs="Arial"/>
-          <w:szCs w:val="22"/>
-          <w:lang w:eastAsia="ja-JP"/>
-        </w:rPr>
-        <w:t>As an operational example, configuring approximately 200 measurement points can take more than one hour with conventional manual relocation on the instrument, whereas using PiXY with offline targeting reduced preparation time to ~20 minutes in a practical case, lowering the barrier to higher</w:t>
+        <w:t xml:space="preserve">error into offline work. In validation (Section 3.3), with five fiducials, 50% of residuals were within 3 </w:t>
+      </w:r>
+      <w:proofErr w:type="spellStart"/>
+      <w:r>
+        <w:rPr>
+          <w:rFonts w:ascii="Arial" w:hAnsi="Arial" w:cs="Arial"/>
+          <w:szCs w:val="22"/>
+          <w:lang w:eastAsia="ja-JP"/>
+        </w:rPr>
+        <w:t>μm</w:t>
+      </w:r>
+      <w:proofErr w:type="spellEnd"/>
+      <w:r>
+        <w:rPr>
+          <w:rFonts w:ascii="Arial" w:hAnsi="Arial" w:cs="Arial"/>
+          <w:szCs w:val="22"/>
+          <w:lang w:eastAsia="ja-JP"/>
+        </w:rPr>
+        <w:t xml:space="preserve"> (X), 3 </w:t>
+      </w:r>
+      <w:proofErr w:type="spellStart"/>
+      <w:r>
+        <w:rPr>
+          <w:rFonts w:ascii="Arial" w:hAnsi="Arial" w:cs="Arial"/>
+          <w:szCs w:val="22"/>
+          <w:lang w:eastAsia="ja-JP"/>
+        </w:rPr>
+        <w:t>μm</w:t>
+      </w:r>
+      <w:proofErr w:type="spellEnd"/>
+      <w:r>
+        <w:rPr>
+          <w:rFonts w:ascii="Arial" w:hAnsi="Arial" w:cs="Arial"/>
+          <w:szCs w:val="22"/>
+          <w:lang w:eastAsia="ja-JP"/>
+        </w:rPr>
+        <w:t xml:space="preserve"> (Y), and 4 </w:t>
+      </w:r>
+      <w:proofErr w:type="spellStart"/>
+      <w:r>
+        <w:rPr>
+          <w:rFonts w:ascii="Arial" w:hAnsi="Arial" w:cs="Arial"/>
+          <w:szCs w:val="22"/>
+          <w:lang w:eastAsia="ja-JP"/>
+        </w:rPr>
+        <w:t>μm</w:t>
+      </w:r>
+      <w:proofErr w:type="spellEnd"/>
+      <w:r>
+        <w:rPr>
+          <w:rFonts w:ascii="Arial" w:hAnsi="Arial" w:cs="Arial"/>
+          <w:szCs w:val="22"/>
+          <w:lang w:eastAsia="ja-JP"/>
+        </w:rPr>
+        <w:t xml:space="preserve"> (Z), and 90% were within 10 </w:t>
+      </w:r>
+      <w:proofErr w:type="spellStart"/>
+      <w:r>
+        <w:rPr>
+          <w:rFonts w:ascii="Arial" w:hAnsi="Arial" w:cs="Arial"/>
+          <w:szCs w:val="22"/>
+          <w:lang w:eastAsia="ja-JP"/>
+        </w:rPr>
+        <w:t>μm</w:t>
+      </w:r>
+      <w:proofErr w:type="spellEnd"/>
+      <w:r>
+        <w:rPr>
+          <w:rFonts w:ascii="Arial" w:hAnsi="Arial" w:cs="Arial"/>
+          <w:szCs w:val="22"/>
+          <w:lang w:eastAsia="ja-JP"/>
+        </w:rPr>
+        <w:t xml:space="preserve"> (X), 16 </w:t>
+      </w:r>
+      <w:proofErr w:type="spellStart"/>
+      <w:r>
+        <w:rPr>
+          <w:rFonts w:ascii="Arial" w:hAnsi="Arial" w:cs="Arial"/>
+          <w:szCs w:val="22"/>
+          <w:lang w:eastAsia="ja-JP"/>
+        </w:rPr>
+        <w:t>μm</w:t>
+      </w:r>
+      <w:proofErr w:type="spellEnd"/>
+      <w:r>
+        <w:rPr>
+          <w:rFonts w:ascii="Arial" w:hAnsi="Arial" w:cs="Arial"/>
+          <w:szCs w:val="22"/>
+          <w:lang w:eastAsia="ja-JP"/>
+        </w:rPr>
+        <w:t xml:space="preserve"> (Y), and 21 </w:t>
+      </w:r>
+      <w:proofErr w:type="spellStart"/>
+      <w:r>
+        <w:rPr>
+          <w:rFonts w:ascii="Arial" w:hAnsi="Arial" w:cs="Arial"/>
+          <w:szCs w:val="22"/>
+          <w:lang w:eastAsia="ja-JP"/>
+        </w:rPr>
+        <w:t>μm</w:t>
+      </w:r>
+      <w:proofErr w:type="spellEnd"/>
+      <w:r>
+        <w:rPr>
+          <w:rFonts w:ascii="Arial" w:hAnsi="Arial" w:cs="Arial"/>
+          <w:szCs w:val="22"/>
+          <w:lang w:eastAsia="ja-JP"/>
+        </w:rPr>
+        <w:t xml:space="preserve"> (Z), indicating practical accuracy and showing that increasing fiducials improves residual distributions.</w:t>
+      </w:r>
+    </w:p>
+    <w:p>
+      <w:pPr>
+        <w:spacing w:after="0" w:line="240" w:lineRule="auto"/>
+        <w:rPr>
+          <w:rFonts w:ascii="Arial" w:hAnsi="Arial" w:cs="Arial"/>
+          <w:szCs w:val="22"/>
+          <w:lang w:eastAsia="ja-JP"/>
+        </w:rPr>
+      </w:pPr>
+    </w:p>
+    <w:p>
+      <w:pPr>
+        <w:spacing w:after="0" w:line="240" w:lineRule="auto"/>
+        <w:rPr>
+          <w:rFonts w:ascii="Arial" w:hAnsi="Arial" w:cs="Arial"/>
+          <w:szCs w:val="22"/>
+          <w:lang w:eastAsia="ja-JP"/>
+        </w:rPr>
+      </w:pPr>
+      <w:r>
+        <w:rPr>
+          <w:rFonts w:ascii="Arial" w:hAnsi="Arial" w:cs="Arial"/>
+          <w:szCs w:val="22"/>
+          <w:lang w:eastAsia="ja-JP"/>
+        </w:rPr>
+        <w:t xml:space="preserve">As an operational example, configuring approximately 200 measurement points can take more than one hour with conventional manual relocation on the instrument, whereas using </w:t>
+      </w:r>
+      <w:proofErr w:type="spellStart"/>
+      <w:r>
+        <w:rPr>
+          <w:rFonts w:ascii="Arial" w:hAnsi="Arial" w:cs="Arial"/>
+          <w:szCs w:val="22"/>
+          <w:lang w:eastAsia="ja-JP"/>
+        </w:rPr>
+        <w:t>PiXY</w:t>
+      </w:r>
+      <w:proofErr w:type="spellEnd"/>
+      <w:r>
+        <w:rPr>
+          <w:rFonts w:ascii="Arial" w:hAnsi="Arial" w:cs="Arial"/>
+          <w:szCs w:val="22"/>
+          <w:lang w:eastAsia="ja-JP"/>
+        </w:rPr>
+        <w:t xml:space="preserve"> with offline targeting reduced preparation time to ~20 minutes in a practical case, lowering the barrier to higher</w:t>
       </w:r>
       <w:r>
         <w:rPr>
@@ -4235,7 +5550,25 @@
           <w:szCs w:val="22"/>
           <w:lang w:eastAsia="ja-JP"/>
         </w:rPr>
-        <w:t>day practice: PiXY manages candidates and fiducials as tables and lets users correct misidentifications or outliers while inspecting overlays and residuals. Because the analysis state can be saved/loaded as a project file (.pixy), hand</w:t>
+        <w:t xml:space="preserve">day practice: </w:t>
+      </w:r>
+      <w:proofErr w:type="spellStart"/>
+      <w:r>
+        <w:rPr>
+          <w:rFonts w:ascii="Arial" w:hAnsi="Arial" w:cs="Arial"/>
+          <w:szCs w:val="22"/>
+          <w:lang w:eastAsia="ja-JP"/>
+        </w:rPr>
+        <w:t>PiXY</w:t>
+      </w:r>
+      <w:proofErr w:type="spellEnd"/>
+      <w:r>
+        <w:rPr>
+          <w:rFonts w:ascii="Arial" w:hAnsi="Arial" w:cs="Arial"/>
+          <w:szCs w:val="22"/>
+          <w:lang w:eastAsia="ja-JP"/>
+        </w:rPr>
+        <w:t xml:space="preserve"> manages candidates and fiducials as tables and lets users correct misidentifications or outliers while inspecting overlays and residuals. Because the analysis state can be saved/loaded as a project file (.pixy), hand</w:t>
       </w:r>
       <w:r>
         <w:rPr>
@@ -4343,7 +5676,61 @@
           <w:szCs w:val="22"/>
           <w:lang w:eastAsia="ja-JP"/>
         </w:rPr>
-        <w:t>(4) Adoption and dissemination: PiXY is publicly available on GitHub and persistently archived on Zenodo (DOI: 10.5281/zenodo.18174474). As the public release is recent, quantitative metrics such as citation counts are not yet informative; however, software can be cited by DOI with version specifications to ensure reproducible use. PiXY is distributed both as Python source and as a standalone Windows executable, enabling use on instrument</w:t>
+        <w:t xml:space="preserve">(4) Adoption and dissemination: </w:t>
+      </w:r>
+      <w:proofErr w:type="spellStart"/>
+      <w:r>
+        <w:rPr>
+          <w:rFonts w:ascii="Arial" w:hAnsi="Arial" w:cs="Arial"/>
+          <w:szCs w:val="22"/>
+          <w:lang w:eastAsia="ja-JP"/>
+        </w:rPr>
+        <w:t>PiXY</w:t>
+      </w:r>
+      <w:proofErr w:type="spellEnd"/>
+      <w:r>
+        <w:rPr>
+          <w:rFonts w:ascii="Arial" w:hAnsi="Arial" w:cs="Arial"/>
+          <w:szCs w:val="22"/>
+          <w:lang w:eastAsia="ja-JP"/>
+        </w:rPr>
+        <w:t xml:space="preserve"> is publicly available on GitHub and persistently archived on </w:t>
+      </w:r>
+      <w:proofErr w:type="spellStart"/>
+      <w:r>
+        <w:rPr>
+          <w:rFonts w:ascii="Arial" w:hAnsi="Arial" w:cs="Arial"/>
+          <w:szCs w:val="22"/>
+          <w:lang w:eastAsia="ja-JP"/>
+        </w:rPr>
+        <w:t>Zenodo</w:t>
+      </w:r>
+      <w:proofErr w:type="spellEnd"/>
+      <w:r>
+        <w:rPr>
+          <w:rFonts w:ascii="Arial" w:hAnsi="Arial" w:cs="Arial"/>
+          <w:szCs w:val="22"/>
+          <w:lang w:eastAsia="ja-JP"/>
+        </w:rPr>
+        <w:t xml:space="preserve"> (DOI: 10.5281/zenodo.18174474). As the public release is recent, quantitative metrics such as citation counts are not yet informative; however, software can be cited by DOI with version specifications to ensure reproducible use. </w:t>
+      </w:r>
+      <w:proofErr w:type="spellStart"/>
+      <w:r>
+        <w:rPr>
+          <w:rFonts w:ascii="Arial" w:hAnsi="Arial" w:cs="Arial"/>
+          <w:szCs w:val="22"/>
+          <w:lang w:eastAsia="ja-JP"/>
+        </w:rPr>
+        <w:t>PiXY</w:t>
+      </w:r>
+      <w:proofErr w:type="spellEnd"/>
+      <w:r>
+        <w:rPr>
+          <w:rFonts w:ascii="Arial" w:hAnsi="Arial" w:cs="Arial"/>
+          <w:szCs w:val="22"/>
+          <w:lang w:eastAsia="ja-JP"/>
+        </w:rPr>
+        <w:t xml:space="preserve"> is distributed both as Python source and as a standalone Windows executable, enabling use on instrument</w:t>
       </w:r>
       <w:r>
         <w:rPr>
@@ -4359,7 +5746,25 @@
           <w:szCs w:val="22"/>
           <w:lang w:eastAsia="ja-JP"/>
         </w:rPr>
-        <w:t>control PCs without a Python environment. Download and usage statistics can be tracked via GitHub/Zenodo for future adoption assessments.</w:t>
+        <w:t>control PCs without a Python environment. Download and usage statistics can be tracked via GitHub/</w:t>
+      </w:r>
+      <w:proofErr w:type="spellStart"/>
+      <w:r>
+        <w:rPr>
+          <w:rFonts w:ascii="Arial" w:hAnsi="Arial" w:cs="Arial"/>
+          <w:szCs w:val="22"/>
+          <w:lang w:eastAsia="ja-JP"/>
+        </w:rPr>
+        <w:t>Zenodo</w:t>
+      </w:r>
+      <w:proofErr w:type="spellEnd"/>
+      <w:r>
+        <w:rPr>
+          <w:rFonts w:ascii="Arial" w:hAnsi="Arial" w:cs="Arial"/>
+          <w:szCs w:val="22"/>
+          <w:lang w:eastAsia="ja-JP"/>
+        </w:rPr>
+        <w:t xml:space="preserve"> for future adoption assessments.</w:t>
       </w:r>
     </w:p>
     <w:p>
@@ -4403,7 +5808,25 @@
           <w:szCs w:val="22"/>
           <w:lang w:eastAsia="ja-JP"/>
         </w:rPr>
-        <w:t>offs: Because PiXY does not depend on manufacturer</w:t>
+        <w:t xml:space="preserve">offs: Because </w:t>
+      </w:r>
+      <w:proofErr w:type="spellStart"/>
+      <w:r>
+        <w:rPr>
+          <w:rFonts w:ascii="Arial" w:hAnsi="Arial" w:cs="Arial"/>
+          <w:szCs w:val="22"/>
+          <w:lang w:eastAsia="ja-JP"/>
+        </w:rPr>
+        <w:t>PiXY</w:t>
+      </w:r>
+      <w:proofErr w:type="spellEnd"/>
+      <w:r>
+        <w:rPr>
+          <w:rFonts w:ascii="Arial" w:hAnsi="Arial" w:cs="Arial"/>
+          <w:szCs w:val="22"/>
+          <w:lang w:eastAsia="ja-JP"/>
+        </w:rPr>
+        <w:t xml:space="preserve"> does not depend on manufacturer</w:t>
       </w:r>
       <w:r>
         <w:rPr>
@@ -4435,7 +5858,25 @@
           <w:szCs w:val="22"/>
           <w:lang w:eastAsia="ja-JP"/>
         </w:rPr>
-        <w:t>off companies or productizations based on PiXY are known.</w:t>
+        <w:t xml:space="preserve">off companies or productizations based on </w:t>
+      </w:r>
+      <w:proofErr w:type="spellStart"/>
+      <w:r>
+        <w:rPr>
+          <w:rFonts w:ascii="Arial" w:hAnsi="Arial" w:cs="Arial"/>
+          <w:szCs w:val="22"/>
+          <w:lang w:eastAsia="ja-JP"/>
+        </w:rPr>
+        <w:t>PiXY</w:t>
+      </w:r>
+      <w:proofErr w:type="spellEnd"/>
+      <w:r>
+        <w:rPr>
+          <w:rFonts w:ascii="Arial" w:hAnsi="Arial" w:cs="Arial"/>
+          <w:szCs w:val="22"/>
+          <w:lang w:eastAsia="ja-JP"/>
+        </w:rPr>
+        <w:t xml:space="preserve"> are known.</w:t>
       </w:r>
     </w:p>
     <w:p>
@@ -4479,7 +5920,43 @@
           <w:szCs w:val="22"/>
           <w:lang w:eastAsia="ja-JP"/>
         </w:rPr>
-        <w:t xml:space="preserve">recognition accuracy for centroid extraction depends on image simplicity and contrast, PiXY accepts externally preprocessed images (e.g., segmentation or </w:t>
+        <w:t xml:space="preserve">recognition accuracy for centroid extraction depends on image simplicity and contrast, </w:t>
+      </w:r>
+      <w:proofErr w:type="spellStart"/>
+      <w:r>
+        <w:rPr>
+          <w:rFonts w:ascii="Arial" w:hAnsi="Arial" w:cs="Arial"/>
+          <w:szCs w:val="22"/>
+          <w:lang w:eastAsia="ja-JP"/>
+        </w:rPr>
+        <w:t>PiXY</w:t>
+      </w:r>
+      <w:proofErr w:type="spellEnd"/>
+      <w:r>
+        <w:rPr>
+          <w:rFonts w:ascii="Arial" w:hAnsi="Arial" w:cs="Arial"/>
+          <w:szCs w:val="22"/>
+          <w:lang w:eastAsia="ja-JP"/>
+        </w:rPr>
+        <w:t xml:space="preserve"> accepts externally </w:t>
+      </w:r>
+      <w:proofErr w:type="spellStart"/>
+      <w:r>
+        <w:rPr>
+          <w:rFonts w:ascii="Arial" w:hAnsi="Arial" w:cs="Arial"/>
+          <w:szCs w:val="22"/>
+          <w:lang w:eastAsia="ja-JP"/>
+        </w:rPr>
+        <w:t>preprocessed</w:t>
+      </w:r>
+      <w:proofErr w:type="spellEnd"/>
+      <w:r>
+        <w:rPr>
+          <w:rFonts w:ascii="Arial" w:hAnsi="Arial" w:cs="Arial"/>
+          <w:szCs w:val="22"/>
+          <w:lang w:eastAsia="ja-JP"/>
+        </w:rPr>
+        <w:t xml:space="preserve"> images (e.g., segmentation or </w:t>
       </w:r>
       <w:r>
         <w:rPr>
@@ -4562,13 +6039,23 @@
           <w:lang w:eastAsia="ja-JP"/>
         </w:rPr>
       </w:pPr>
-      <w:r>
-        <w:rPr>
-          <w:rFonts w:ascii="Arial" w:hAnsi="Arial" w:cs="Arial"/>
-          <w:szCs w:val="22"/>
-          <w:lang w:eastAsia="ja-JP"/>
-        </w:rPr>
-        <w:t>PiXY integrates candidate generation (centroid extraction) and fiducial</w:t>
+      <w:proofErr w:type="spellStart"/>
+      <w:r>
+        <w:rPr>
+          <w:rFonts w:ascii="Arial" w:hAnsi="Arial" w:cs="Arial"/>
+          <w:szCs w:val="22"/>
+          <w:lang w:eastAsia="ja-JP"/>
+        </w:rPr>
+        <w:t>PiXY</w:t>
+      </w:r>
+      <w:proofErr w:type="spellEnd"/>
+      <w:r>
+        <w:rPr>
+          <w:rFonts w:ascii="Arial" w:hAnsi="Arial" w:cs="Arial"/>
+          <w:szCs w:val="22"/>
+          <w:lang w:eastAsia="ja-JP"/>
+        </w:rPr>
+        <w:t xml:space="preserve"> integrates candidate generation (centroid extraction) and fiducial</w:t>
       </w:r>
       <w:r>
         <w:rPr>
@@ -4612,7 +6099,25 @@
           <w:szCs w:val="22"/>
           <w:lang w:eastAsia="ja-JP"/>
         </w:rPr>
-        <w:t>Validation with real specimens shows that increasing the number of fiducial points improves residual distributions, confirming that PiXY achieves accuracy sufficient for practical operation. Future work includes integrating preprocessing/segmentation and further automation via instrument</w:t>
+        <w:t xml:space="preserve">Validation with real specimens shows that increasing the number of fiducial points improves residual distributions, confirming that </w:t>
+      </w:r>
+      <w:proofErr w:type="spellStart"/>
+      <w:r>
+        <w:rPr>
+          <w:rFonts w:ascii="Arial" w:hAnsi="Arial" w:cs="Arial"/>
+          <w:szCs w:val="22"/>
+          <w:lang w:eastAsia="ja-JP"/>
+        </w:rPr>
+        <w:t>PiXY</w:t>
+      </w:r>
+      <w:proofErr w:type="spellEnd"/>
+      <w:r>
+        <w:rPr>
+          <w:rFonts w:ascii="Arial" w:hAnsi="Arial" w:cs="Arial"/>
+          <w:szCs w:val="22"/>
+          <w:lang w:eastAsia="ja-JP"/>
+        </w:rPr>
+        <w:t xml:space="preserve"> achieves accuracy sufficient for practical operation. Future work includes integrating preprocessing/segmentation and further automation via instrument</w:t>
       </w:r>
       <w:r>
         <w:rPr>
@@ -4723,7 +6228,29 @@
           <w:iCs/>
           <w:szCs w:val="22"/>
         </w:rPr>
-        <w:t>During development, the author used AI-assisted tools (GitHub Copilot, Google Gemini, xAI Grok, Anthropic Claude) for manuscript editing suggestions and programming support. All generated outputs were reviewed and validated by the author, who takes full responsibility for the final content.</w:t>
+        <w:t xml:space="preserve">During development, the author used AI-assisted tools (GitHub Copilot, Google Gemini, </w:t>
+      </w:r>
+      <w:proofErr w:type="spellStart"/>
+      <w:r>
+        <w:rPr>
+          <w:rFonts w:ascii="Arial" w:hAnsi="Arial" w:cs="Arial"/>
+          <w:bCs/>
+          <w:i/>
+          <w:iCs/>
+          <w:szCs w:val="22"/>
+        </w:rPr>
+        <w:t>xAI</w:t>
+      </w:r>
+      <w:proofErr w:type="spellEnd"/>
+      <w:r>
+        <w:rPr>
+          <w:rFonts w:ascii="Arial" w:hAnsi="Arial" w:cs="Arial"/>
+          <w:bCs/>
+          <w:i/>
+          <w:iCs/>
+          <w:szCs w:val="22"/>
+        </w:rPr>
+        <w:t xml:space="preserve"> Grok, Anthropic Claude) for manuscript editing suggestions and programming support. All generated outputs were reviewed and validated by the author, who takes full responsibility for the final content.</w:t>
       </w:r>
     </w:p>
     <w:p>
@@ -4790,7 +6317,29 @@
           <w:iCs/>
           <w:szCs w:val="22"/>
         </w:rPr>
-        <w:t>During the preparation of this work the author used GitHub Copilot, Google Gemini, xAI Grok, and Anthropic Claude in order to assist with drafting and programming tasks. After using these tools, the author reviewed and edited the content as needed and takes full responsibility for the content of the published article.</w:t>
+        <w:t xml:space="preserve">During the preparation of this work the author used GitHub Copilot, Google Gemini, </w:t>
+      </w:r>
+      <w:proofErr w:type="spellStart"/>
+      <w:r>
+        <w:rPr>
+          <w:rFonts w:ascii="Arial" w:hAnsi="Arial" w:cs="Arial"/>
+          <w:bCs/>
+          <w:i/>
+          <w:iCs/>
+          <w:szCs w:val="22"/>
+        </w:rPr>
+        <w:t>xAI</w:t>
+      </w:r>
+      <w:proofErr w:type="spellEnd"/>
+      <w:r>
+        <w:rPr>
+          <w:rFonts w:ascii="Arial" w:hAnsi="Arial" w:cs="Arial"/>
+          <w:bCs/>
+          <w:i/>
+          <w:iCs/>
+          <w:szCs w:val="22"/>
+        </w:rPr>
+        <w:t xml:space="preserve"> Grok, and Anthropic Claude in order to assist with drafting and programming tasks. After using these tools, the author reviewed and edited the content as needed and takes full responsibility for the content of the published article.</w:t>
       </w:r>
     </w:p>
     <w:p>
@@ -4853,7 +6402,43 @@
           <w:bCs/>
           <w:i/>
         </w:rPr>
-        <w:t>[1] Sheriff J, Fletcher IW, Cumpson PJ. Computer-readable image markers for automated registration in correlative microscopy (autoCRIM) [preprint]. arXiv:2011.14949. 2020. https://doi.org/10.48550/arXiv.2011.14949.</w:t>
+        <w:t xml:space="preserve">[1] Sheriff J, Fletcher IW, </w:t>
+      </w:r>
+      <w:proofErr w:type="spellStart"/>
+      <w:r>
+        <w:rPr>
+          <w:rFonts w:ascii="Arial" w:hAnsi="Arial" w:cs="Arial"/>
+          <w:bCs/>
+          <w:i/>
+        </w:rPr>
+        <w:t>Cumpson</w:t>
+      </w:r>
+      <w:proofErr w:type="spellEnd"/>
+      <w:r>
+        <w:rPr>
+          <w:rFonts w:ascii="Arial" w:hAnsi="Arial" w:cs="Arial"/>
+          <w:bCs/>
+          <w:i/>
+        </w:rPr>
+        <w:t xml:space="preserve"> PJ. Computer-readable image markers for automated registration in correlative microscopy (</w:t>
+      </w:r>
+      <w:proofErr w:type="spellStart"/>
+      <w:r>
+        <w:rPr>
+          <w:rFonts w:ascii="Arial" w:hAnsi="Arial" w:cs="Arial"/>
+          <w:bCs/>
+          <w:i/>
+        </w:rPr>
+        <w:t>autoCRIM</w:t>
+      </w:r>
+      <w:proofErr w:type="spellEnd"/>
+      <w:r>
+        <w:rPr>
+          <w:rFonts w:ascii="Arial" w:hAnsi="Arial" w:cs="Arial"/>
+          <w:bCs/>
+          <w:i/>
+        </w:rPr>
+        <w:t>) [preprint]. arXiv:2011.14949. 2020. https://doi.org/10.48550/arXiv.2011.14949.</w:t>
       </w:r>
     </w:p>
     <w:p>
@@ -4943,7 +6528,25 @@
           <w:bCs/>
           <w:i/>
         </w:rPr>
-        <w:t>[4] Bradski G. The OpenCV library. Dr Dobb's Journal of Software Tools. 2000.</w:t>
+        <w:t xml:space="preserve">[4] </w:t>
+      </w:r>
+      <w:proofErr w:type="spellStart"/>
+      <w:r>
+        <w:rPr>
+          <w:rFonts w:ascii="Arial" w:hAnsi="Arial" w:cs="Arial"/>
+          <w:bCs/>
+          <w:i/>
+        </w:rPr>
+        <w:t>Bradski</w:t>
+      </w:r>
+      <w:proofErr w:type="spellEnd"/>
+      <w:r>
+        <w:rPr>
+          <w:rFonts w:ascii="Arial" w:hAnsi="Arial" w:cs="Arial"/>
+          <w:bCs/>
+          <w:i/>
+        </w:rPr>
+        <w:t xml:space="preserve"> G. The OpenCV library. Dr Dobb's Journal of Software Tools. 2000.</w:t>
       </w:r>
     </w:p>
     <w:p>
@@ -4973,10 +6576,46 @@
           <w:bCs/>
           <w:i/>
         </w:rPr>
-        <w:t>[5] Harris CR, Millman KJ, van der Walt SJ, Gommers R, Virtanen P, Cournapeau D, et al. Array programming with NumPy. Nature. 2020;585(7825):357-62. https://doi.org/10.1038/s41586-020-2649-2.</w:t>
-      </w:r>
-      <w:bookmarkEnd w:id="5"/>
-    </w:p>
+        <w:t xml:space="preserve">[5] Harris CR, Millman KJ, van der Walt SJ, </w:t>
+      </w:r>
+      <w:proofErr w:type="spellStart"/>
+      <w:r>
+        <w:rPr>
+          <w:rFonts w:ascii="Arial" w:hAnsi="Arial" w:cs="Arial"/>
+          <w:bCs/>
+          <w:i/>
+        </w:rPr>
+        <w:t>Gommers</w:t>
+      </w:r>
+      <w:proofErr w:type="spellEnd"/>
+      <w:r>
+        <w:rPr>
+          <w:rFonts w:ascii="Arial" w:hAnsi="Arial" w:cs="Arial"/>
+          <w:bCs/>
+          <w:i/>
+        </w:rPr>
+        <w:t xml:space="preserve"> R, Virtanen P, </w:t>
+      </w:r>
+      <w:proofErr w:type="spellStart"/>
+      <w:r>
+        <w:rPr>
+          <w:rFonts w:ascii="Arial" w:hAnsi="Arial" w:cs="Arial"/>
+          <w:bCs/>
+          <w:i/>
+        </w:rPr>
+        <w:t>Cournapeau</w:t>
+      </w:r>
+      <w:proofErr w:type="spellEnd"/>
+      <w:r>
+        <w:rPr>
+          <w:rFonts w:ascii="Arial" w:hAnsi="Arial" w:cs="Arial"/>
+          <w:bCs/>
+          <w:i/>
+        </w:rPr>
+        <w:t xml:space="preserve"> D, et al. Array programming with NumPy. Nature. 2020;585(7825):357-62. https://doi.org/10.1038/s41586-020-2649-2.</w:t>
+      </w:r>
+    </w:p>
+    <w:bookmarkEnd w:id="5"/>
     <w:sectPr>
       <w:footerReference w:type="default" r:id="rId10"/>
       <w:pgSz w:w="12240" w:h="15840"/>

</xml_diff>

<commit_message>
release: bump to v1.3.3 and improve neck separation performance
</commit_message>
<xml_diff>
--- a/documentation/softwarex-osp-kon.docx
+++ b/documentation/softwarex-osp-kon.docx
@@ -7,6 +7,38 @@
       <w:pPr>
         <w:spacing w:after="0" w:line="240" w:lineRule="auto"/>
         <w:rPr>
+          <w:rFonts w:ascii="Arial" w:hAnsi="Arial" w:cs="Arial"/>
+          <w:b/>
+          <w:i/>
+          <w:iCs/>
+          <w:szCs w:val="22"/>
+          <w:lang w:eastAsia="ja-JP"/>
+        </w:rPr>
+      </w:pPr>
+      <w:proofErr w:type="spellStart"/>
+      <w:r>
+        <w:rPr>
+          <w:rFonts w:ascii="Arial" w:eastAsia="Calibri" w:hAnsi="Arial" w:cs="Arial"/>
+          <w:b/>
+          <w:i/>
+          <w:iCs/>
+          <w:szCs w:val="22"/>
+        </w:rPr>
+        <w:t>PiXY</w:t>
+      </w:r>
+      <w:proofErr w:type="spellEnd"/>
+      <w:r>
+        <w:rPr>
+          <w:rFonts w:ascii="Arial" w:eastAsia="Calibri" w:hAnsi="Arial" w:cs="Arial"/>
+          <w:b/>
+          <w:i/>
+          <w:iCs/>
+          <w:szCs w:val="22"/>
+        </w:rPr>
+        <w:t>: Pixel to stage-XY Coordinate Convert</w:t>
+      </w:r>
+      <w:r>
+        <w:rPr>
           <w:rFonts w:ascii="Arial" w:hAnsi="Arial" w:cs="Arial" w:hint="eastAsia"/>
           <w:b/>
           <w:i/>
@@ -14,38 +46,6 @@
           <w:szCs w:val="22"/>
           <w:lang w:eastAsia="ja-JP"/>
         </w:rPr>
-      </w:pPr>
-      <w:proofErr w:type="spellStart"/>
-      <w:r>
-        <w:rPr>
-          <w:rFonts w:ascii="Arial" w:eastAsia="Calibri" w:hAnsi="Arial" w:cs="Arial"/>
-          <w:b/>
-          <w:i/>
-          <w:iCs/>
-          <w:szCs w:val="22"/>
-        </w:rPr>
-        <w:t>PiXY</w:t>
-      </w:r>
-      <w:proofErr w:type="spellEnd"/>
-      <w:r>
-        <w:rPr>
-          <w:rFonts w:ascii="Arial" w:eastAsia="Calibri" w:hAnsi="Arial" w:cs="Arial"/>
-          <w:b/>
-          <w:i/>
-          <w:iCs/>
-          <w:szCs w:val="22"/>
-        </w:rPr>
-        <w:t>: Pixel to stage-XY Coordinate Convert</w:t>
-      </w:r>
-      <w:r>
-        <w:rPr>
-          <w:rFonts w:ascii="Arial" w:hAnsi="Arial" w:cs="Arial" w:hint="eastAsia"/>
-          <w:b/>
-          <w:i/>
-          <w:iCs/>
-          <w:szCs w:val="22"/>
-          <w:lang w:eastAsia="ja-JP"/>
-        </w:rPr>
         <w:t>er</w:t>
       </w:r>
     </w:p>
@@ -53,7 +53,7 @@
       <w:pPr>
         <w:spacing w:after="0" w:line="240" w:lineRule="auto"/>
         <w:rPr>
-          <w:rFonts w:ascii="Arial" w:hAnsi="Arial" w:cs="Arial" w:hint="eastAsia"/>
+          <w:rFonts w:ascii="Arial" w:hAnsi="Arial" w:cs="Arial"/>
           <w:szCs w:val="22"/>
           <w:lang w:eastAsia="ja-JP"/>
         </w:rPr>
@@ -102,15 +102,14 @@
       <w:pPr>
         <w:spacing w:after="0"/>
         <w:rPr>
+          <w:lang w:eastAsia="ja-JP"/>
+        </w:rPr>
+      </w:pPr>
+      <w:r>
+        <w:rPr>
           <w:rFonts w:hint="eastAsia"/>
           <w:lang w:eastAsia="ja-JP"/>
         </w:rPr>
-      </w:pPr>
-      <w:r>
-        <w:rPr>
-          <w:rFonts w:hint="eastAsia"/>
-          <w:lang w:eastAsia="ja-JP"/>
-        </w:rPr>
         <w:t>Central 7, 1-1-1, Higashi, Tsukuba, Ibaraki, Japan, 305-8567</w:t>
       </w:r>
     </w:p>
@@ -118,7 +117,6 @@
       <w:pPr>
         <w:spacing w:after="0"/>
         <w:rPr>
-          <w:rFonts w:hint="eastAsia"/>
           <w:lang w:eastAsia="ja-JP"/>
         </w:rPr>
       </w:pPr>
@@ -154,7 +152,7 @@
         </w:tabs>
         <w:spacing w:before="0" w:line="240" w:lineRule="auto"/>
         <w:rPr>
-          <w:rFonts w:ascii="Arial" w:eastAsia="ＭＳ 明朝" w:hAnsi="Arial" w:cs="Arial" w:hint="eastAsia"/>
+          <w:rFonts w:ascii="Arial" w:eastAsia="ＭＳ 明朝" w:hAnsi="Arial" w:cs="Arial"/>
           <w:b w:val="0"/>
           <w:sz w:val="22"/>
           <w:szCs w:val="22"/>
@@ -184,21 +182,121 @@
       <w:pPr>
         <w:spacing w:after="0" w:line="240" w:lineRule="auto"/>
         <w:rPr>
+          <w:rFonts w:ascii="Arial" w:hAnsi="Arial" w:cs="Arial"/>
+          <w:szCs w:val="22"/>
+          <w:lang w:eastAsia="ja-JP"/>
+        </w:rPr>
+      </w:pPr>
+    </w:p>
+    <w:p>
+      <w:pPr>
+        <w:spacing w:after="0" w:line="240" w:lineRule="auto"/>
+        <w:rPr>
+          <w:rFonts w:ascii="Arial" w:hAnsi="Arial" w:cs="Arial"/>
+          <w:szCs w:val="22"/>
+          <w:lang w:eastAsia="ja-JP"/>
+        </w:rPr>
+      </w:pPr>
+      <w:proofErr w:type="spellStart"/>
+      <w:r>
+        <w:rPr>
+          <w:rFonts w:ascii="Arial" w:hAnsi="Arial" w:cs="Arial"/>
+          <w:szCs w:val="22"/>
+          <w:lang w:eastAsia="ja-JP"/>
+        </w:rPr>
+        <w:t>PiXY</w:t>
+      </w:r>
+      <w:proofErr w:type="spellEnd"/>
+      <w:r>
+        <w:rPr>
+          <w:rFonts w:ascii="Arial" w:hAnsi="Arial" w:cs="Arial"/>
+          <w:szCs w:val="22"/>
+          <w:lang w:eastAsia="ja-JP"/>
+        </w:rPr>
+        <w:t xml:space="preserve"> is open</w:t>
+      </w:r>
+      <w:r>
+        <w:rPr>
+          <w:rFonts w:ascii="Cambria Math" w:hAnsi="Cambria Math" w:cs="Cambria Math"/>
+          <w:szCs w:val="22"/>
+          <w:lang w:eastAsia="ja-JP"/>
+        </w:rPr>
+        <w:t>‑</w:t>
+      </w:r>
+      <w:r>
+        <w:rPr>
+          <w:rFonts w:ascii="Arial" w:hAnsi="Arial" w:cs="Arial"/>
+          <w:szCs w:val="22"/>
+          <w:lang w:eastAsia="ja-JP"/>
+        </w:rPr>
+        <w:t>source software that links target selection on microscopy images with physical positioning on analytical</w:t>
+      </w:r>
+      <w:r>
+        <w:rPr>
+          <w:rFonts w:ascii="Cambria Math" w:hAnsi="Cambria Math" w:cs="Cambria Math"/>
+          <w:szCs w:val="22"/>
+          <w:lang w:eastAsia="ja-JP"/>
+        </w:rPr>
+        <w:t>‑</w:t>
+      </w:r>
+      <w:r>
+        <w:rPr>
+          <w:rFonts w:ascii="Arial" w:hAnsi="Arial" w:cs="Arial"/>
+          <w:szCs w:val="22"/>
+          <w:lang w:eastAsia="ja-JP"/>
+        </w:rPr>
+        <w:t xml:space="preserve">instrument stages in microanalysis workflows for geoscience and materials science, thereby reducing manual time and human error. </w:t>
+      </w:r>
+      <w:proofErr w:type="spellStart"/>
+      <w:r>
+        <w:rPr>
+          <w:rFonts w:ascii="Arial" w:hAnsi="Arial" w:cs="Arial"/>
+          <w:szCs w:val="22"/>
+          <w:lang w:eastAsia="ja-JP"/>
+        </w:rPr>
+        <w:t>PiXY</w:t>
+      </w:r>
+      <w:proofErr w:type="spellEnd"/>
+      <w:r>
+        <w:rPr>
+          <w:rFonts w:ascii="Arial" w:hAnsi="Arial" w:cs="Arial"/>
+          <w:szCs w:val="22"/>
+          <w:lang w:eastAsia="ja-JP"/>
+        </w:rPr>
+        <w:t xml:space="preserve"> automatically extracts particle centroids (u,</w:t>
+      </w:r>
+      <w:r>
+        <w:rPr>
           <w:rFonts w:ascii="Arial" w:hAnsi="Arial" w:cs="Arial" w:hint="eastAsia"/>
           <w:szCs w:val="22"/>
           <w:lang w:eastAsia="ja-JP"/>
         </w:rPr>
-      </w:pPr>
-    </w:p>
-    <w:p>
-      <w:pPr>
-        <w:spacing w:after="0" w:line="240" w:lineRule="auto"/>
-        <w:rPr>
-          <w:rFonts w:ascii="Arial" w:hAnsi="Arial" w:cs="Arial"/>
-          <w:szCs w:val="22"/>
-          <w:lang w:eastAsia="ja-JP"/>
-        </w:rPr>
-      </w:pPr>
+        <w:t xml:space="preserve"> </w:t>
+      </w:r>
+      <w:r>
+        <w:rPr>
+          <w:rFonts w:ascii="Arial" w:hAnsi="Arial" w:cs="Arial"/>
+          <w:szCs w:val="22"/>
+          <w:lang w:eastAsia="ja-JP"/>
+        </w:rPr>
+        <w:t>v) by combining K</w:t>
+      </w:r>
+      <w:r>
+        <w:rPr>
+          <w:rFonts w:ascii="Cambria Math" w:hAnsi="Cambria Math" w:cs="Cambria Math"/>
+          <w:szCs w:val="22"/>
+          <w:lang w:eastAsia="ja-JP"/>
+        </w:rPr>
+        <w:t>‑</w:t>
+      </w:r>
+      <w:r>
+        <w:rPr>
+          <w:rFonts w:ascii="Arial" w:hAnsi="Arial" w:cs="Arial"/>
+          <w:szCs w:val="22"/>
+          <w:lang w:eastAsia="ja-JP"/>
+        </w:rPr>
+        <w:t xml:space="preserve">means </w:t>
+      </w:r>
       <w:proofErr w:type="spellStart"/>
       <w:r>
         <w:rPr>
@@ -206,6 +304,142 @@
           <w:szCs w:val="22"/>
           <w:lang w:eastAsia="ja-JP"/>
         </w:rPr>
+        <w:t>color</w:t>
+      </w:r>
+      <w:proofErr w:type="spellEnd"/>
+      <w:r>
+        <w:rPr>
+          <w:rFonts w:ascii="Arial" w:hAnsi="Arial" w:cs="Arial"/>
+          <w:szCs w:val="22"/>
+          <w:lang w:eastAsia="ja-JP"/>
+        </w:rPr>
+        <w:t xml:space="preserve"> segmentation with connected</w:t>
+      </w:r>
+      <w:r>
+        <w:rPr>
+          <w:rFonts w:ascii="Cambria Math" w:hAnsi="Cambria Math" w:cs="Cambria Math"/>
+          <w:szCs w:val="22"/>
+          <w:lang w:eastAsia="ja-JP"/>
+        </w:rPr>
+        <w:t>‑</w:t>
+      </w:r>
+      <w:r>
+        <w:rPr>
+          <w:rFonts w:ascii="Arial" w:hAnsi="Arial" w:cs="Arial"/>
+          <w:szCs w:val="22"/>
+          <w:lang w:eastAsia="ja-JP"/>
+        </w:rPr>
+        <w:t xml:space="preserve">component </w:t>
+      </w:r>
+      <w:proofErr w:type="gramStart"/>
+      <w:r>
+        <w:rPr>
+          <w:rFonts w:ascii="Arial" w:hAnsi="Arial" w:cs="Arial"/>
+          <w:szCs w:val="22"/>
+          <w:lang w:eastAsia="ja-JP"/>
+        </w:rPr>
+        <w:t>analysis, and</w:t>
+      </w:r>
+      <w:proofErr w:type="gramEnd"/>
+      <w:r>
+        <w:rPr>
+          <w:rFonts w:ascii="Arial" w:hAnsi="Arial" w:cs="Arial"/>
+          <w:szCs w:val="22"/>
+          <w:lang w:eastAsia="ja-JP"/>
+        </w:rPr>
+        <w:t xml:space="preserve"> estimates a least</w:t>
+      </w:r>
+      <w:r>
+        <w:rPr>
+          <w:rFonts w:ascii="Cambria Math" w:hAnsi="Cambria Math" w:cs="Cambria Math"/>
+          <w:szCs w:val="22"/>
+          <w:lang w:eastAsia="ja-JP"/>
+        </w:rPr>
+        <w:t>‑</w:t>
+      </w:r>
+      <w:r>
+        <w:rPr>
+          <w:rFonts w:ascii="Arial" w:hAnsi="Arial" w:cs="Arial"/>
+          <w:szCs w:val="22"/>
+          <w:lang w:eastAsia="ja-JP"/>
+        </w:rPr>
+        <w:t>squares affine transform from user</w:t>
+      </w:r>
+      <w:r>
+        <w:rPr>
+          <w:rFonts w:ascii="Cambria Math" w:hAnsi="Cambria Math" w:cs="Cambria Math"/>
+          <w:szCs w:val="22"/>
+          <w:lang w:eastAsia="ja-JP"/>
+        </w:rPr>
+        <w:t>‑</w:t>
+      </w:r>
+      <w:r>
+        <w:rPr>
+          <w:rFonts w:ascii="Arial" w:hAnsi="Arial" w:cs="Arial"/>
+          <w:szCs w:val="22"/>
+          <w:lang w:eastAsia="ja-JP"/>
+        </w:rPr>
+        <w:t>acquired fiducials to convert image coordinates into instrument stage coordinates (X,</w:t>
+      </w:r>
+      <w:r>
+        <w:rPr>
+          <w:rFonts w:ascii="Arial" w:hAnsi="Arial" w:cs="Arial" w:hint="eastAsia"/>
+          <w:szCs w:val="22"/>
+          <w:lang w:eastAsia="ja-JP"/>
+        </w:rPr>
+        <w:t xml:space="preserve"> </w:t>
+      </w:r>
+      <w:r>
+        <w:rPr>
+          <w:rFonts w:ascii="Arial" w:hAnsi="Arial" w:cs="Arial"/>
+          <w:szCs w:val="22"/>
+          <w:lang w:eastAsia="ja-JP"/>
+        </w:rPr>
+        <w:t>Y,</w:t>
+      </w:r>
+      <w:r>
+        <w:rPr>
+          <w:rFonts w:ascii="Arial" w:hAnsi="Arial" w:cs="Arial" w:hint="eastAsia"/>
+          <w:szCs w:val="22"/>
+          <w:lang w:eastAsia="ja-JP"/>
+        </w:rPr>
+        <w:t xml:space="preserve"> </w:t>
+      </w:r>
+      <w:r>
+        <w:rPr>
+          <w:rFonts w:ascii="Arial" w:hAnsi="Arial" w:cs="Arial"/>
+          <w:szCs w:val="22"/>
+          <w:lang w:eastAsia="ja-JP"/>
+        </w:rPr>
+        <w:t>Z).</w:t>
+      </w:r>
+    </w:p>
+    <w:p>
+      <w:pPr>
+        <w:spacing w:after="0" w:line="240" w:lineRule="auto"/>
+        <w:rPr>
+          <w:rFonts w:ascii="Arial" w:hAnsi="Arial" w:cs="Arial"/>
+          <w:szCs w:val="22"/>
+          <w:lang w:eastAsia="ja-JP"/>
+        </w:rPr>
+      </w:pPr>
+    </w:p>
+    <w:p>
+      <w:pPr>
+        <w:spacing w:after="0" w:line="240" w:lineRule="auto"/>
+        <w:rPr>
+          <w:rFonts w:ascii="Arial" w:hAnsi="Arial" w:cs="Arial"/>
+          <w:szCs w:val="22"/>
+          <w:lang w:eastAsia="ja-JP"/>
+        </w:rPr>
+      </w:pPr>
+      <w:proofErr w:type="spellStart"/>
+      <w:r>
+        <w:rPr>
+          <w:rFonts w:ascii="Arial" w:hAnsi="Arial" w:cs="Arial"/>
+          <w:szCs w:val="22"/>
+          <w:lang w:eastAsia="ja-JP"/>
+        </w:rPr>
         <w:t>PiXY</w:t>
       </w:r>
       <w:proofErr w:type="spellEnd"/>
@@ -215,7 +449,7 @@
           <w:szCs w:val="22"/>
           <w:lang w:eastAsia="ja-JP"/>
         </w:rPr>
-        <w:t xml:space="preserve"> is open</w:t>
+        <w:t xml:space="preserve"> supports offline targeting, enabling users to select targets on pre</w:t>
       </w:r>
       <w:r>
         <w:rPr>
@@ -231,7 +465,7 @@
           <w:szCs w:val="22"/>
           <w:lang w:eastAsia="ja-JP"/>
         </w:rPr>
-        <w:t>source software that links target selection on microscopy images with physical positioning on analytical</w:t>
+        <w:t>acquired images and prepare stage coordinates before instrument time. This shifts workload away from the instrument, shortens non</w:t>
       </w:r>
       <w:r>
         <w:rPr>
@@ -247,7 +481,99 @@
           <w:szCs w:val="22"/>
           <w:lang w:eastAsia="ja-JP"/>
         </w:rPr>
-        <w:t xml:space="preserve">instrument stages in microanalysis workflows for geoscience and materials science, thereby reducing manual time and human error. </w:t>
+        <w:t>measurement stage operations, and improves instrument utilization. No dedicated fiducial markers or special sample preparation are required; repeatably identifiable sample features can be used as fiducials.</w:t>
+      </w:r>
+    </w:p>
+    <w:p>
+      <w:pPr>
+        <w:spacing w:after="0" w:line="240" w:lineRule="auto"/>
+        <w:rPr>
+          <w:rFonts w:ascii="Arial" w:hAnsi="Arial" w:cs="Arial"/>
+          <w:szCs w:val="22"/>
+          <w:lang w:eastAsia="ja-JP"/>
+        </w:rPr>
+      </w:pPr>
+    </w:p>
+    <w:p>
+      <w:pPr>
+        <w:spacing w:after="0" w:line="240" w:lineRule="auto"/>
+        <w:rPr>
+          <w:rFonts w:ascii="Arial" w:hAnsi="Arial" w:cs="Arial"/>
+          <w:szCs w:val="22"/>
+          <w:lang w:eastAsia="ja-JP"/>
+        </w:rPr>
+      </w:pPr>
+      <w:r>
+        <w:rPr>
+          <w:rFonts w:ascii="Arial" w:hAnsi="Arial" w:cs="Arial"/>
+          <w:szCs w:val="22"/>
+          <w:lang w:eastAsia="ja-JP"/>
+        </w:rPr>
+        <w:t>Validation on real specimens (N</w:t>
+      </w:r>
+      <w:r>
+        <w:rPr>
+          <w:rFonts w:ascii="Arial" w:hAnsi="Arial" w:cs="Arial" w:hint="eastAsia"/>
+          <w:szCs w:val="22"/>
+          <w:lang w:eastAsia="ja-JP"/>
+        </w:rPr>
+        <w:t xml:space="preserve"> </w:t>
+      </w:r>
+      <w:r>
+        <w:rPr>
+          <w:rFonts w:ascii="Arial" w:hAnsi="Arial" w:cs="Arial"/>
+          <w:szCs w:val="22"/>
+          <w:lang w:eastAsia="ja-JP"/>
+        </w:rPr>
+        <w:t>=</w:t>
+      </w:r>
+      <w:r>
+        <w:rPr>
+          <w:rFonts w:ascii="Arial" w:hAnsi="Arial" w:cs="Arial" w:hint="eastAsia"/>
+          <w:szCs w:val="22"/>
+          <w:lang w:eastAsia="ja-JP"/>
+        </w:rPr>
+        <w:t xml:space="preserve"> </w:t>
+      </w:r>
+      <w:r>
+        <w:rPr>
+          <w:rFonts w:ascii="Arial" w:hAnsi="Arial" w:cs="Arial"/>
+          <w:szCs w:val="22"/>
+          <w:lang w:eastAsia="ja-JP"/>
+        </w:rPr>
+        <w:t>100, five fiducials</w:t>
+      </w:r>
+      <w:r>
+        <w:rPr>
+          <w:rFonts w:ascii="Arial" w:hAnsi="Arial" w:cs="Arial" w:hint="eastAsia"/>
+          <w:szCs w:val="22"/>
+          <w:lang w:eastAsia="ja-JP"/>
+        </w:rPr>
+        <w:t>)</w:t>
+      </w:r>
+      <w:r>
+        <w:rPr>
+          <w:rFonts w:ascii="Arial" w:hAnsi="Arial" w:cs="Arial"/>
+          <w:szCs w:val="22"/>
+          <w:lang w:eastAsia="ja-JP"/>
+        </w:rPr>
+        <w:t xml:space="preserve"> evaluated the on</w:t>
+      </w:r>
+      <w:r>
+        <w:rPr>
+          <w:rFonts w:ascii="Cambria Math" w:hAnsi="Cambria Math" w:cs="Cambria Math"/>
+          <w:szCs w:val="22"/>
+          <w:lang w:eastAsia="ja-JP"/>
+        </w:rPr>
+        <w:t>‑</w:t>
+      </w:r>
+      <w:r>
+        <w:rPr>
+          <w:rFonts w:ascii="Arial" w:hAnsi="Arial" w:cs="Arial"/>
+          <w:szCs w:val="22"/>
+          <w:lang w:eastAsia="ja-JP"/>
+        </w:rPr>
+        <w:t>instrument reaching error (residual) for positions specified on images. Fifty percent of residuals were within 3 </w:t>
       </w:r>
       <w:proofErr w:type="spellStart"/>
       <w:r>
@@ -256,7 +582,7 @@
           <w:szCs w:val="22"/>
           <w:lang w:eastAsia="ja-JP"/>
         </w:rPr>
-        <w:t>PiXY</w:t>
+        <w:t>μm</w:t>
       </w:r>
       <w:proofErr w:type="spellEnd"/>
       <w:r>
@@ -265,7 +591,7 @@
           <w:szCs w:val="22"/>
           <w:lang w:eastAsia="ja-JP"/>
         </w:rPr>
-        <w:t xml:space="preserve"> automatically extracts particle centroids (</w:t>
+        <w:t xml:space="preserve"> (X), 3 </w:t>
       </w:r>
       <w:proofErr w:type="spellStart"/>
       <w:r>
@@ -274,7 +600,7 @@
           <w:szCs w:val="22"/>
           <w:lang w:eastAsia="ja-JP"/>
         </w:rPr>
-        <w:t>u,v</w:t>
+        <w:t>μm</w:t>
       </w:r>
       <w:proofErr w:type="spellEnd"/>
       <w:r>
@@ -283,7 +609,7 @@
           <w:szCs w:val="22"/>
           <w:lang w:eastAsia="ja-JP"/>
         </w:rPr>
-        <w:t>)(</w:t>
+        <w:t xml:space="preserve"> (Y), and 4 </w:t>
       </w:r>
       <w:proofErr w:type="spellStart"/>
       <w:r>
@@ -292,7 +618,7 @@
           <w:szCs w:val="22"/>
           <w:lang w:eastAsia="ja-JP"/>
         </w:rPr>
-        <w:t>u,v</w:t>
+        <w:t>μm</w:t>
       </w:r>
       <w:proofErr w:type="spellEnd"/>
       <w:r>
@@ -301,7 +627,7 @@
           <w:szCs w:val="22"/>
           <w:lang w:eastAsia="ja-JP"/>
         </w:rPr>
-        <w:t>)(</w:t>
+        <w:t xml:space="preserve"> (Z), and 90% were within 10 </w:t>
       </w:r>
       <w:proofErr w:type="spellStart"/>
       <w:r>
@@ -310,7 +636,7 @@
           <w:szCs w:val="22"/>
           <w:lang w:eastAsia="ja-JP"/>
         </w:rPr>
-        <w:t>u,v</w:t>
+        <w:t>μm</w:t>
       </w:r>
       <w:proofErr w:type="spellEnd"/>
       <w:r>
@@ -319,23 +645,7 @@
           <w:szCs w:val="22"/>
           <w:lang w:eastAsia="ja-JP"/>
         </w:rPr>
-        <w:t>) by combining K</w:t>
-      </w:r>
-      <w:r>
-        <w:rPr>
-          <w:rFonts w:ascii="Cambria Math" w:hAnsi="Cambria Math" w:cs="Cambria Math"/>
-          <w:szCs w:val="22"/>
-          <w:lang w:eastAsia="ja-JP"/>
-        </w:rPr>
-        <w:t>‑</w:t>
-      </w:r>
-      <w:r>
-        <w:rPr>
-          <w:rFonts w:ascii="Arial" w:hAnsi="Arial" w:cs="Arial"/>
-          <w:szCs w:val="22"/>
-          <w:lang w:eastAsia="ja-JP"/>
-        </w:rPr>
-        <w:t xml:space="preserve">means </w:t>
+        <w:t xml:space="preserve"> (X), 16 </w:t>
       </w:r>
       <w:proofErr w:type="spellStart"/>
       <w:r>
@@ -344,7 +654,7 @@
           <w:szCs w:val="22"/>
           <w:lang w:eastAsia="ja-JP"/>
         </w:rPr>
-        <w:t>color</w:t>
+        <w:t>μm</w:t>
       </w:r>
       <w:proofErr w:type="spellEnd"/>
       <w:r>
@@ -353,76 +663,8 @@
           <w:szCs w:val="22"/>
           <w:lang w:eastAsia="ja-JP"/>
         </w:rPr>
-        <w:t xml:space="preserve"> segmentation with connected</w:t>
-      </w:r>
-      <w:r>
-        <w:rPr>
-          <w:rFonts w:ascii="Cambria Math" w:hAnsi="Cambria Math" w:cs="Cambria Math"/>
-          <w:szCs w:val="22"/>
-          <w:lang w:eastAsia="ja-JP"/>
-        </w:rPr>
-        <w:t>‑</w:t>
-      </w:r>
-      <w:r>
-        <w:rPr>
-          <w:rFonts w:ascii="Arial" w:hAnsi="Arial" w:cs="Arial"/>
-          <w:szCs w:val="22"/>
-          <w:lang w:eastAsia="ja-JP"/>
-        </w:rPr>
-        <w:t>component analysis, and estimates a least</w:t>
-      </w:r>
-      <w:r>
-        <w:rPr>
-          <w:rFonts w:ascii="Cambria Math" w:hAnsi="Cambria Math" w:cs="Cambria Math"/>
-          <w:szCs w:val="22"/>
-          <w:lang w:eastAsia="ja-JP"/>
-        </w:rPr>
-        <w:t>‑</w:t>
-      </w:r>
-      <w:r>
-        <w:rPr>
-          <w:rFonts w:ascii="Arial" w:hAnsi="Arial" w:cs="Arial"/>
-          <w:szCs w:val="22"/>
-          <w:lang w:eastAsia="ja-JP"/>
-        </w:rPr>
-        <w:t>squares affine transform from user</w:t>
-      </w:r>
-      <w:r>
-        <w:rPr>
-          <w:rFonts w:ascii="Cambria Math" w:hAnsi="Cambria Math" w:cs="Cambria Math"/>
-          <w:szCs w:val="22"/>
-          <w:lang w:eastAsia="ja-JP"/>
-        </w:rPr>
-        <w:t>‑</w:t>
-      </w:r>
-      <w:r>
-        <w:rPr>
-          <w:rFonts w:ascii="Arial" w:hAnsi="Arial" w:cs="Arial"/>
-          <w:szCs w:val="22"/>
-          <w:lang w:eastAsia="ja-JP"/>
-        </w:rPr>
-        <w:t>acquired fiducials to convert image coordinates into instrument stage coordinates (X,Y,Z).</w:t>
-      </w:r>
-    </w:p>
-    <w:p>
-      <w:pPr>
-        <w:spacing w:after="0" w:line="240" w:lineRule="auto"/>
-        <w:rPr>
-          <w:rFonts w:ascii="Arial" w:hAnsi="Arial" w:cs="Arial"/>
-          <w:szCs w:val="22"/>
-          <w:lang w:eastAsia="ja-JP"/>
-        </w:rPr>
-      </w:pPr>
-    </w:p>
-    <w:p>
-      <w:pPr>
-        <w:spacing w:after="0" w:line="240" w:lineRule="auto"/>
-        <w:rPr>
-          <w:rFonts w:ascii="Arial" w:hAnsi="Arial" w:cs="Arial"/>
-          <w:szCs w:val="22"/>
-          <w:lang w:eastAsia="ja-JP"/>
-        </w:rPr>
-      </w:pPr>
+        <w:t xml:space="preserve"> (Y), and 21 </w:t>
+      </w:r>
       <w:proofErr w:type="spellStart"/>
       <w:r>
         <w:rPr>
@@ -430,7 +672,7 @@
           <w:szCs w:val="22"/>
           <w:lang w:eastAsia="ja-JP"/>
         </w:rPr>
-        <w:t>PiXY</w:t>
+        <w:t>μm</w:t>
       </w:r>
       <w:proofErr w:type="spellEnd"/>
       <w:r>
@@ -439,206 +681,6 @@
           <w:szCs w:val="22"/>
           <w:lang w:eastAsia="ja-JP"/>
         </w:rPr>
-        <w:t xml:space="preserve"> supports offline targeting, enabling users to select targets on pre</w:t>
-      </w:r>
-      <w:r>
-        <w:rPr>
-          <w:rFonts w:ascii="Cambria Math" w:hAnsi="Cambria Math" w:cs="Cambria Math"/>
-          <w:szCs w:val="22"/>
-          <w:lang w:eastAsia="ja-JP"/>
-        </w:rPr>
-        <w:t>‑</w:t>
-      </w:r>
-      <w:r>
-        <w:rPr>
-          <w:rFonts w:ascii="Arial" w:hAnsi="Arial" w:cs="Arial"/>
-          <w:szCs w:val="22"/>
-          <w:lang w:eastAsia="ja-JP"/>
-        </w:rPr>
-        <w:t>acquired images and prepare stage coordinates before instrument time. This shifts workload away from the instrument, shortens non</w:t>
-      </w:r>
-      <w:r>
-        <w:rPr>
-          <w:rFonts w:ascii="Cambria Math" w:hAnsi="Cambria Math" w:cs="Cambria Math"/>
-          <w:szCs w:val="22"/>
-          <w:lang w:eastAsia="ja-JP"/>
-        </w:rPr>
-        <w:t>‑</w:t>
-      </w:r>
-      <w:r>
-        <w:rPr>
-          <w:rFonts w:ascii="Arial" w:hAnsi="Arial" w:cs="Arial"/>
-          <w:szCs w:val="22"/>
-          <w:lang w:eastAsia="ja-JP"/>
-        </w:rPr>
-        <w:t>measurement stage operations, and improves instrument utilization. No dedicated fiducial markers or special sample preparation are required; repeatably identifiable sample features can be used as fiducials.</w:t>
-      </w:r>
-    </w:p>
-    <w:p>
-      <w:pPr>
-        <w:spacing w:after="0" w:line="240" w:lineRule="auto"/>
-        <w:rPr>
-          <w:rFonts w:ascii="Arial" w:hAnsi="Arial" w:cs="Arial"/>
-          <w:szCs w:val="22"/>
-          <w:lang w:eastAsia="ja-JP"/>
-        </w:rPr>
-      </w:pPr>
-    </w:p>
-    <w:p>
-      <w:pPr>
-        <w:spacing w:after="0" w:line="240" w:lineRule="auto"/>
-        <w:rPr>
-          <w:rFonts w:ascii="Arial" w:hAnsi="Arial" w:cs="Arial"/>
-          <w:szCs w:val="22"/>
-          <w:lang w:eastAsia="ja-JP"/>
-        </w:rPr>
-      </w:pPr>
-      <w:r>
-        <w:rPr>
-          <w:rFonts w:ascii="Arial" w:hAnsi="Arial" w:cs="Arial"/>
-          <w:szCs w:val="22"/>
-          <w:lang w:eastAsia="ja-JP"/>
-        </w:rPr>
-        <w:t>Validation on real specimens (N=100, five fiducials</w:t>
-      </w:r>
-      <w:r>
-        <w:rPr>
-          <w:rFonts w:ascii="Arial" w:hAnsi="Arial" w:cs="Arial" w:hint="eastAsia"/>
-          <w:szCs w:val="22"/>
-          <w:lang w:eastAsia="ja-JP"/>
-        </w:rPr>
-        <w:t>)</w:t>
-      </w:r>
-      <w:r>
-        <w:rPr>
-          <w:rFonts w:ascii="Arial" w:hAnsi="Arial" w:cs="Arial"/>
-          <w:szCs w:val="22"/>
-          <w:lang w:eastAsia="ja-JP"/>
-        </w:rPr>
-        <w:t xml:space="preserve"> evaluated the on</w:t>
-      </w:r>
-      <w:r>
-        <w:rPr>
-          <w:rFonts w:ascii="Cambria Math" w:hAnsi="Cambria Math" w:cs="Cambria Math"/>
-          <w:szCs w:val="22"/>
-          <w:lang w:eastAsia="ja-JP"/>
-        </w:rPr>
-        <w:t>‑</w:t>
-      </w:r>
-      <w:r>
-        <w:rPr>
-          <w:rFonts w:ascii="Arial" w:hAnsi="Arial" w:cs="Arial"/>
-          <w:szCs w:val="22"/>
-          <w:lang w:eastAsia="ja-JP"/>
-        </w:rPr>
-        <w:t>instrument reaching error (residual) for positions specified on images. Fifty percent of residuals were within 3 </w:t>
-      </w:r>
-      <w:proofErr w:type="spellStart"/>
-      <w:r>
-        <w:rPr>
-          <w:rFonts w:ascii="Arial" w:hAnsi="Arial" w:cs="Arial"/>
-          <w:szCs w:val="22"/>
-          <w:lang w:eastAsia="ja-JP"/>
-        </w:rPr>
-        <w:t>μm</w:t>
-      </w:r>
-      <w:proofErr w:type="spellEnd"/>
-      <w:r>
-        <w:rPr>
-          <w:rFonts w:ascii="Arial" w:hAnsi="Arial" w:cs="Arial"/>
-          <w:szCs w:val="22"/>
-          <w:lang w:eastAsia="ja-JP"/>
-        </w:rPr>
-        <w:t xml:space="preserve"> (X), 3 </w:t>
-      </w:r>
-      <w:proofErr w:type="spellStart"/>
-      <w:r>
-        <w:rPr>
-          <w:rFonts w:ascii="Arial" w:hAnsi="Arial" w:cs="Arial"/>
-          <w:szCs w:val="22"/>
-          <w:lang w:eastAsia="ja-JP"/>
-        </w:rPr>
-        <w:t>μm</w:t>
-      </w:r>
-      <w:proofErr w:type="spellEnd"/>
-      <w:r>
-        <w:rPr>
-          <w:rFonts w:ascii="Arial" w:hAnsi="Arial" w:cs="Arial"/>
-          <w:szCs w:val="22"/>
-          <w:lang w:eastAsia="ja-JP"/>
-        </w:rPr>
-        <w:t xml:space="preserve"> (Y), and 4 </w:t>
-      </w:r>
-      <w:proofErr w:type="spellStart"/>
-      <w:r>
-        <w:rPr>
-          <w:rFonts w:ascii="Arial" w:hAnsi="Arial" w:cs="Arial"/>
-          <w:szCs w:val="22"/>
-          <w:lang w:eastAsia="ja-JP"/>
-        </w:rPr>
-        <w:t>μm</w:t>
-      </w:r>
-      <w:proofErr w:type="spellEnd"/>
-      <w:r>
-        <w:rPr>
-          <w:rFonts w:ascii="Arial" w:hAnsi="Arial" w:cs="Arial"/>
-          <w:szCs w:val="22"/>
-          <w:lang w:eastAsia="ja-JP"/>
-        </w:rPr>
-        <w:t xml:space="preserve"> (Z), and 90% were within 10 </w:t>
-      </w:r>
-      <w:proofErr w:type="spellStart"/>
-      <w:r>
-        <w:rPr>
-          <w:rFonts w:ascii="Arial" w:hAnsi="Arial" w:cs="Arial"/>
-          <w:szCs w:val="22"/>
-          <w:lang w:eastAsia="ja-JP"/>
-        </w:rPr>
-        <w:t>μm</w:t>
-      </w:r>
-      <w:proofErr w:type="spellEnd"/>
-      <w:r>
-        <w:rPr>
-          <w:rFonts w:ascii="Arial" w:hAnsi="Arial" w:cs="Arial"/>
-          <w:szCs w:val="22"/>
-          <w:lang w:eastAsia="ja-JP"/>
-        </w:rPr>
-        <w:t xml:space="preserve"> (X), 16 </w:t>
-      </w:r>
-      <w:proofErr w:type="spellStart"/>
-      <w:r>
-        <w:rPr>
-          <w:rFonts w:ascii="Arial" w:hAnsi="Arial" w:cs="Arial"/>
-          <w:szCs w:val="22"/>
-          <w:lang w:eastAsia="ja-JP"/>
-        </w:rPr>
-        <w:t>μm</w:t>
-      </w:r>
-      <w:proofErr w:type="spellEnd"/>
-      <w:r>
-        <w:rPr>
-          <w:rFonts w:ascii="Arial" w:hAnsi="Arial" w:cs="Arial"/>
-          <w:szCs w:val="22"/>
-          <w:lang w:eastAsia="ja-JP"/>
-        </w:rPr>
-        <w:t xml:space="preserve"> (Y), and 21 </w:t>
-      </w:r>
-      <w:proofErr w:type="spellStart"/>
-      <w:r>
-        <w:rPr>
-          <w:rFonts w:ascii="Arial" w:hAnsi="Arial" w:cs="Arial"/>
-          <w:szCs w:val="22"/>
-          <w:lang w:eastAsia="ja-JP"/>
-        </w:rPr>
-        <w:t>μm</w:t>
-      </w:r>
-      <w:proofErr w:type="spellEnd"/>
-      <w:r>
-        <w:rPr>
-          <w:rFonts w:ascii="Arial" w:hAnsi="Arial" w:cs="Arial"/>
-          <w:szCs w:val="22"/>
-          <w:lang w:eastAsia="ja-JP"/>
-        </w:rPr>
         <w:t xml:space="preserve"> (Z), demonstrating accuracy sufficient for practical operation.</w:t>
       </w:r>
     </w:p>
@@ -646,7 +688,7 @@
       <w:pPr>
         <w:spacing w:after="0" w:line="240" w:lineRule="auto"/>
         <w:rPr>
-          <w:rFonts w:ascii="Arial" w:hAnsi="Arial" w:cs="Arial" w:hint="eastAsia"/>
+          <w:rFonts w:ascii="Arial" w:hAnsi="Arial" w:cs="Arial"/>
           <w:szCs w:val="22"/>
           <w:lang w:eastAsia="ja-JP"/>
         </w:rPr>
@@ -685,7 +727,7 @@
       <w:pPr>
         <w:spacing w:after="0" w:line="240" w:lineRule="auto"/>
         <w:rPr>
-          <w:rFonts w:ascii="Arial" w:hAnsi="Arial" w:cs="Arial" w:hint="eastAsia"/>
+          <w:rFonts w:ascii="Arial" w:hAnsi="Arial" w:cs="Arial"/>
           <w:szCs w:val="22"/>
           <w:lang w:eastAsia="ja-JP"/>
         </w:rPr>
@@ -709,17 +751,7 @@
           <w:szCs w:val="22"/>
           <w:lang w:eastAsia="ja-JP"/>
         </w:rPr>
-        <w:t xml:space="preserve">LA-ICP-MS; </w:t>
-      </w:r>
-      <w:r>
-        <w:rPr>
-          <w:rFonts w:ascii="Arial" w:eastAsia="Calibri" w:hAnsi="Arial" w:cs="Arial"/>
-          <w:bCs/>
-          <w:i/>
-          <w:iCs/>
-          <w:szCs w:val="22"/>
-        </w:rPr>
-        <w:t>microscopy targeting; image registration;</w:t>
+        <w:t>LA-ICP-MS</w:t>
       </w:r>
     </w:p>
     <w:p>
@@ -901,7 +933,7 @@
           <w:p>
             <w:pPr>
               <w:rPr>
-                <w:rFonts w:ascii="Arial" w:hAnsi="Arial" w:cs="Arial" w:hint="eastAsia"/>
+                <w:rFonts w:ascii="Arial" w:hAnsi="Arial" w:cs="Arial"/>
                 <w:szCs w:val="22"/>
                 <w:lang w:eastAsia="ja-JP"/>
               </w:rPr>
@@ -1227,7 +1259,7 @@
           <w:p>
             <w:pPr>
               <w:rPr>
-                <w:rFonts w:ascii="Arial" w:hAnsi="Arial" w:cs="Arial" w:hint="eastAsia"/>
+                <w:rFonts w:ascii="Arial" w:hAnsi="Arial" w:cs="Arial"/>
                 <w:szCs w:val="22"/>
                 <w:lang w:eastAsia="ja-JP"/>
               </w:rPr>
@@ -1574,7 +1606,7 @@
           <w:p>
             <w:pPr>
               <w:rPr>
-                <w:rFonts w:ascii="Arial" w:hAnsi="Arial" w:cs="Arial" w:hint="eastAsia"/>
+                <w:rFonts w:ascii="Arial" w:hAnsi="Arial" w:cs="Arial"/>
                 <w:szCs w:val="22"/>
                 <w:lang w:eastAsia="ja-JP"/>
               </w:rPr>
@@ -1613,7 +1645,7 @@
       <w:pPr>
         <w:spacing w:after="0" w:line="240" w:lineRule="auto"/>
         <w:rPr>
-          <w:rFonts w:ascii="Arial" w:hAnsi="Arial" w:cs="Arial" w:hint="eastAsia"/>
+          <w:rFonts w:ascii="Arial" w:hAnsi="Arial" w:cs="Arial"/>
           <w:szCs w:val="22"/>
           <w:lang w:eastAsia="ja-JP"/>
         </w:rPr>
@@ -1778,7 +1810,7 @@
       <w:pPr>
         <w:spacing w:after="0" w:line="240" w:lineRule="auto"/>
         <w:rPr>
-          <w:rFonts w:ascii="Arial" w:hAnsi="Arial" w:cs="Arial" w:hint="eastAsia"/>
+          <w:rFonts w:ascii="Arial" w:hAnsi="Arial" w:cs="Arial"/>
           <w:i/>
           <w:szCs w:val="22"/>
           <w:lang w:eastAsia="ja-JP"/>
@@ -1856,7 +1888,7 @@
       <w:pPr>
         <w:spacing w:after="0" w:line="240" w:lineRule="auto"/>
         <w:rPr>
-          <w:rFonts w:ascii="Arial" w:hAnsi="Arial" w:cs="Arial" w:hint="eastAsia"/>
+          <w:rFonts w:ascii="Arial" w:hAnsi="Arial" w:cs="Arial"/>
           <w:i/>
           <w:szCs w:val="22"/>
           <w:lang w:eastAsia="ja-JP"/>
@@ -1986,7 +2018,7 @@
       <w:pPr>
         <w:spacing w:after="0" w:line="240" w:lineRule="auto"/>
         <w:rPr>
-          <w:rFonts w:ascii="Arial" w:hAnsi="Arial" w:cs="Arial" w:hint="eastAsia"/>
+          <w:rFonts w:ascii="Arial" w:hAnsi="Arial" w:cs="Arial"/>
           <w:i/>
           <w:szCs w:val="22"/>
           <w:lang w:eastAsia="ja-JP"/>
@@ -2084,7 +2116,7 @@
       <w:pPr>
         <w:spacing w:after="0" w:line="240" w:lineRule="auto"/>
         <w:rPr>
-          <w:rFonts w:ascii="Arial" w:hAnsi="Arial" w:cs="Arial" w:hint="eastAsia"/>
+          <w:rFonts w:ascii="Arial" w:hAnsi="Arial" w:cs="Arial"/>
           <w:szCs w:val="22"/>
           <w:lang w:eastAsia="ja-JP"/>
         </w:rPr>
@@ -2422,7 +2454,6 @@
         <w:spacing w:after="0"/>
         <w:ind w:leftChars="400" w:left="880"/>
         <w:rPr>
-          <w:rFonts w:hint="eastAsia"/>
           <w:lang w:eastAsia="ja-JP"/>
         </w:rPr>
       </w:pPr>
@@ -2557,7 +2588,6 @@
       <w:pPr>
         <w:spacing w:after="0"/>
         <w:rPr>
-          <w:rFonts w:hint="eastAsia"/>
           <w:lang w:eastAsia="ja-JP"/>
         </w:rPr>
       </w:pPr>
@@ -2733,7 +2763,7 @@
         <w:spacing w:after="0" w:line="240" w:lineRule="auto"/>
         <w:ind w:leftChars="400" w:left="880"/>
         <w:rPr>
-          <w:rFonts w:ascii="Arial" w:hAnsi="Arial" w:cs="Arial" w:hint="eastAsia"/>
+          <w:rFonts w:ascii="Arial" w:hAnsi="Arial" w:cs="Arial"/>
           <w:i/>
           <w:szCs w:val="22"/>
           <w:lang w:eastAsia="ja-JP"/>
@@ -2996,7 +3026,7 @@
       <w:pPr>
         <w:spacing w:after="0" w:line="240" w:lineRule="auto"/>
         <w:rPr>
-          <w:rFonts w:ascii="Arial" w:hAnsi="Arial" w:cs="Arial" w:hint="eastAsia"/>
+          <w:rFonts w:ascii="Arial" w:hAnsi="Arial" w:cs="Arial"/>
           <w:szCs w:val="22"/>
           <w:lang w:eastAsia="ja-JP"/>
         </w:rPr>
@@ -3433,7 +3463,25 @@
           <w:i/>
           <w:szCs w:val="22"/>
         </w:rPr>
-        <w:t>Select “Save Project” to save the input image, processing settings, and extracted centroids as a project file (.pixy, JSON format). In addition, “Export Image” saves an overlay image with centroid indices drawn on the original image.</w:t>
+        <w:t xml:space="preserve">Select “Save Project” to save the input image, processing settings, and extracted centroids as a project file </w:t>
+      </w:r>
+      <w:proofErr w:type="gramStart"/>
+      <w:r>
+        <w:rPr>
+          <w:rFonts w:ascii="Arial" w:eastAsia="Calibri" w:hAnsi="Arial" w:cs="Arial"/>
+          <w:i/>
+          <w:szCs w:val="22"/>
+        </w:rPr>
+        <w:t>(.pixy</w:t>
+      </w:r>
+      <w:proofErr w:type="gramEnd"/>
+      <w:r>
+        <w:rPr>
+          <w:rFonts w:ascii="Arial" w:eastAsia="Calibri" w:hAnsi="Arial" w:cs="Arial"/>
+          <w:i/>
+          <w:szCs w:val="22"/>
+        </w:rPr>
+        <w:t>, JSON format). In addition, “Export Image” saves an overlay image with centroid indices drawn on the original image.</w:t>
       </w:r>
     </w:p>
     <w:p>
@@ -3441,7 +3489,7 @@
         <w:spacing w:after="0" w:line="240" w:lineRule="auto"/>
         <w:ind w:leftChars="400" w:left="880"/>
         <w:rPr>
-          <w:rFonts w:ascii="Arial" w:hAnsi="Arial" w:cs="Arial" w:hint="eastAsia"/>
+          <w:rFonts w:ascii="Arial" w:hAnsi="Arial" w:cs="Arial"/>
           <w:i/>
           <w:szCs w:val="22"/>
           <w:lang w:eastAsia="ja-JP"/>
@@ -4450,7 +4498,7 @@
       <w:proofErr w:type="spellStart"/>
       <w:r>
         <w:rPr>
-          <w:rFonts w:ascii="Arial" w:eastAsia="Calibri" w:hAnsi="Arial" w:cs="Arial" w:hint="eastAsia"/>
+          <w:rFonts w:ascii="Arial" w:eastAsia="Calibri" w:hAnsi="Arial" w:cs="Arial"/>
           <w:i/>
           <w:szCs w:val="22"/>
         </w:rPr>
@@ -4693,7 +4741,7 @@
         <w:spacing w:after="0" w:line="240" w:lineRule="auto"/>
         <w:ind w:leftChars="400" w:left="880"/>
         <w:rPr>
-          <w:rFonts w:ascii="Arial" w:hAnsi="Arial" w:cs="Arial" w:hint="eastAsia"/>
+          <w:rFonts w:ascii="Arial" w:hAnsi="Arial" w:cs="Arial"/>
           <w:b/>
           <w:i/>
           <w:szCs w:val="22"/>
@@ -4706,7 +4754,7 @@
         <w:spacing w:after="0" w:line="240" w:lineRule="auto"/>
         <w:ind w:leftChars="400" w:left="880"/>
         <w:rPr>
-          <w:rFonts w:ascii="Arial" w:hAnsi="Arial" w:cs="Arial" w:hint="eastAsia"/>
+          <w:rFonts w:ascii="Arial" w:hAnsi="Arial" w:cs="Arial"/>
           <w:b/>
           <w:i/>
           <w:szCs w:val="22"/>
@@ -6140,7 +6188,7 @@
       <w:pPr>
         <w:spacing w:after="0" w:line="240" w:lineRule="auto"/>
         <w:rPr>
-          <w:rFonts w:ascii="Arial" w:hAnsi="Arial" w:cs="Arial" w:hint="eastAsia"/>
+          <w:rFonts w:ascii="Arial" w:hAnsi="Arial" w:cs="Arial"/>
           <w:szCs w:val="22"/>
           <w:lang w:eastAsia="ja-JP"/>
         </w:rPr>
@@ -6303,7 +6351,7 @@
       <w:pPr>
         <w:spacing w:after="0" w:line="240" w:lineRule="auto"/>
         <w:rPr>
-          <w:rFonts w:ascii="Arial" w:eastAsia="Times New Roman" w:hAnsi="Arial" w:cs="Arial" w:hint="eastAsia"/>
+          <w:rFonts w:ascii="Arial" w:eastAsia="Times New Roman" w:hAnsi="Arial" w:cs="Arial"/>
           <w:b/>
           <w:szCs w:val="22"/>
           <w:lang w:val="en" w:eastAsia="ja-JP"/>
@@ -6339,7 +6387,29 @@
           <w:iCs/>
           <w:szCs w:val="22"/>
         </w:rPr>
-        <w:t xml:space="preserve"> Grok, and Anthropic Claude in order to assist with drafting and programming tasks. After using these tools, the author reviewed and edited the content as needed and takes full responsibility for the content of the published article.</w:t>
+        <w:t xml:space="preserve"> Grok, and Anthropic Claude </w:t>
+      </w:r>
+      <w:proofErr w:type="gramStart"/>
+      <w:r>
+        <w:rPr>
+          <w:rFonts w:ascii="Arial" w:hAnsi="Arial" w:cs="Arial"/>
+          <w:bCs/>
+          <w:i/>
+          <w:iCs/>
+          <w:szCs w:val="22"/>
+        </w:rPr>
+        <w:t>in order to</w:t>
+      </w:r>
+      <w:proofErr w:type="gramEnd"/>
+      <w:r>
+        <w:rPr>
+          <w:rFonts w:ascii="Arial" w:hAnsi="Arial" w:cs="Arial"/>
+          <w:bCs/>
+          <w:i/>
+          <w:iCs/>
+          <w:szCs w:val="22"/>
+        </w:rPr>
+        <w:t xml:space="preserve"> assist with drafting and programming tasks. After using these tools, the author reviewed and edited the content as needed and takes full responsibility for the content of the published article.</w:t>
       </w:r>
     </w:p>
     <w:p>
@@ -6614,8 +6684,8 @@
         </w:rPr>
         <w:t xml:space="preserve"> D, et al. Array programming with NumPy. Nature. 2020;585(7825):357-62. https://doi.org/10.1038/s41586-020-2649-2.</w:t>
       </w:r>
-    </w:p>
-    <w:bookmarkEnd w:id="5"/>
+      <w:bookmarkEnd w:id="5"/>
+    </w:p>
     <w:sectPr>
       <w:footerReference w:type="default" r:id="rId10"/>
       <w:pgSz w:w="12240" w:h="15840"/>
@@ -9389,6 +9459,7 @@
   <w:style w:type="character" w:default="1" w:styleId="a0">
     <w:name w:val="Default Paragraph Font"/>
     <w:uiPriority w:val="1"/>
+    <w:semiHidden/>
     <w:unhideWhenUsed/>
   </w:style>
   <w:style w:type="table" w:default="1" w:styleId="a1">

</xml_diff>